<commit_message>
Update architecture docs for multi-photo, delete overlay, prompt restructure
Documents three changes since the last update: multi-photo upload
support (thumbnails, per-photo removal, payload size safety check),
the account-deleted success overlay with deferred seeding, and the
quality-floor prompt restructure. Also adds the unfixed session-hydration
race in boot()/initSupabase() to Known Issues, surfaced during a separate
diagnostic pass but not yet resolved. Regenerates the Word doc to match.

Co-Authored-By: Claude Sonnet 5 <noreply@anthropic.com>
</commit_message>
<xml_diff>
--- a/Winederella-Architecture.docx
+++ b/Winederella-Architecture.docx
@@ -11,7 +11,7 @@
           <w:rFonts w:ascii="Arial" w:cs="Arial" w:eastAsia="Arial" w:hAnsi="Arial"/>
           <w:b/>
           <w:bCs/>
-          <w:color w:val="2A2440"/>
+          <w:color w:val="2A0A1E"/>
           <w:sz w:val="56"/>
           <w:szCs w:val="56"/>
         </w:rPr>
@@ -25,7 +25,7 @@
       <w:r>
         <w:rPr>
           <w:rFonts w:ascii="Arial" w:cs="Arial" w:eastAsia="Arial" w:hAnsi="Arial"/>
-          <w:color w:val="7B6FA0"/>
+          <w:color w:val="6B4455"/>
           <w:sz w:val="32"/>
           <w:szCs w:val="32"/>
         </w:rPr>
@@ -39,21 +39,21 @@
       <w:r>
         <w:rPr>
           <w:rFonts w:ascii="Arial" w:cs="Arial" w:eastAsia="Arial" w:hAnsi="Arial"/>
-          <w:color w:val="7B6FA0"/>
-          <w:sz w:val="20"/>
-          <w:szCs w:val="20"/>
-        </w:rPr>
-        <w:t xml:space="preserve">Last updated: 16 July 2026</w:t>
-      </w:r>
-    </w:p>
-    <w:p>
-      <w:pPr>
-        <w:spacing w:after="60" w:before="0"/>
-      </w:pPr>
-      <w:r>
-        <w:rPr>
-          <w:rFonts w:ascii="Arial" w:cs="Arial" w:eastAsia="Arial" w:hAnsi="Arial"/>
-          <w:color w:val="7B6FA0"/>
+          <w:color w:val="6B4455"/>
+          <w:sz w:val="20"/>
+          <w:szCs w:val="20"/>
+        </w:rPr>
+        <w:t xml:space="preserve">Last updated: 18 August 2026</w:t>
+      </w:r>
+    </w:p>
+    <w:p>
+      <w:pPr>
+        <w:spacing w:after="60" w:before="0"/>
+      </w:pPr>
+      <w:r>
+        <w:rPr>
+          <w:rFonts w:ascii="Arial" w:cs="Arial" w:eastAsia="Arial" w:hAnsi="Arial"/>
+          <w:color w:val="6B4455"/>
           <w:sz w:val="20"/>
           <w:szCs w:val="20"/>
         </w:rPr>
@@ -62,7 +62,7 @@
       <w:r>
         <w:rPr>
           <w:rFonts w:ascii="Arial" w:cs="Arial" w:eastAsia="Arial" w:hAnsi="Arial"/>
-          <w:color w:val="7B6FA0"/>
+          <w:color w:val="6B4455"/>
           <w:sz w:val="20"/>
           <w:szCs w:val="20"/>
           <w:u w:val="single"/>
@@ -77,7 +77,7 @@
       <w:r>
         <w:rPr>
           <w:rFonts w:ascii="Arial" w:cs="Arial" w:eastAsia="Arial" w:hAnsi="Arial"/>
-          <w:color w:val="7B6FA0"/>
+          <w:color w:val="6B4455"/>
           <w:sz w:val="20"/>
           <w:szCs w:val="20"/>
         </w:rPr>
@@ -87,7 +87,7 @@
     <w:p>
       <w:pPr>
         <w:pBdr>
-          <w:bottom w:val="single" w:color="C5C0D4" w:sz="6" w:space="1"/>
+          <w:bottom w:val="single" w:color="C4A898" w:sz="6" w:space="1"/>
         </w:pBdr>
         <w:spacing w:after="200" w:before="200"/>
       </w:pPr>
@@ -102,7 +102,7 @@
           <w:rFonts w:ascii="Arial" w:cs="Arial" w:eastAsia="Arial" w:hAnsi="Arial"/>
           <w:b/>
           <w:bCs/>
-          <w:color w:val="2A2440"/>
+          <w:color w:val="2A0A1E"/>
           <w:sz w:val="32"/>
           <w:szCs w:val="32"/>
         </w:rPr>
@@ -137,7 +137,7 @@
           <w:rFonts w:ascii="Arial" w:cs="Arial" w:eastAsia="Arial" w:hAnsi="Arial"/>
           <w:b/>
           <w:bCs/>
-          <w:color w:val="2A2440"/>
+          <w:color w:val="2A0A1E"/>
           <w:sz w:val="32"/>
           <w:szCs w:val="32"/>
         </w:rPr>
@@ -168,12 +168,12 @@
           <w:tcPr>
             <w:tcW w:type="dxa" w:w="2800"/>
             <w:tcBorders>
-              <w:top w:val="single" w:color="E0DDE8" w:sz="4"/>
-              <w:left w:val="single" w:color="E0DDE8" w:sz="4"/>
-              <w:bottom w:val="single" w:color="E0DDE8" w:sz="4"/>
-              <w:right w:val="single" w:color="E0DDE8" w:sz="4"/>
+              <w:top w:val="single" w:color="E5DDD4" w:sz="4"/>
+              <w:left w:val="single" w:color="E5DDD4" w:sz="4"/>
+              <w:bottom w:val="single" w:color="E5DDD4" w:sz="4"/>
+              <w:right w:val="single" w:color="E5DDD4" w:sz="4"/>
             </w:tcBorders>
-            <w:shd w:fill="2A2440" w:val="clear"/>
+            <w:shd w:fill="2A0A1E" w:val="clear"/>
             <w:tcMar>
               <w:top w:type="dxa" w:w="80"/>
               <w:left w:type="dxa" w:w="150"/>
@@ -203,12 +203,12 @@
           <w:tcPr>
             <w:tcW w:type="dxa" w:w="6226"/>
             <w:tcBorders>
-              <w:top w:val="single" w:color="E0DDE8" w:sz="4"/>
-              <w:left w:val="single" w:color="E0DDE8" w:sz="4"/>
-              <w:bottom w:val="single" w:color="E0DDE8" w:sz="4"/>
-              <w:right w:val="single" w:color="E0DDE8" w:sz="4"/>
+              <w:top w:val="single" w:color="E5DDD4" w:sz="4"/>
+              <w:left w:val="single" w:color="E5DDD4" w:sz="4"/>
+              <w:bottom w:val="single" w:color="E5DDD4" w:sz="4"/>
+              <w:right w:val="single" w:color="E5DDD4" w:sz="4"/>
             </w:tcBorders>
-            <w:shd w:fill="2A2440" w:val="clear"/>
+            <w:shd w:fill="2A0A1E" w:val="clear"/>
             <w:tcMar>
               <w:top w:type="dxa" w:w="80"/>
               <w:left w:type="dxa" w:w="150"/>
@@ -240,10 +240,10 @@
           <w:tcPr>
             <w:tcW w:type="dxa" w:w="2800"/>
             <w:tcBorders>
-              <w:top w:val="single" w:color="E0DDE8" w:sz="4"/>
-              <w:left w:val="single" w:color="E0DDE8" w:sz="4"/>
-              <w:bottom w:val="single" w:color="E0DDE8" w:sz="4"/>
-              <w:right w:val="single" w:color="E0DDE8" w:sz="4"/>
+              <w:top w:val="single" w:color="E5DDD4" w:sz="4"/>
+              <w:left w:val="single" w:color="E5DDD4" w:sz="4"/>
+              <w:bottom w:val="single" w:color="E5DDD4" w:sz="4"/>
+              <w:right w:val="single" w:color="E5DDD4" w:sz="4"/>
             </w:tcBorders>
             <w:tcMar>
               <w:top w:type="dxa" w:w="80"/>
@@ -274,10 +274,10 @@
           <w:tcPr>
             <w:tcW w:type="dxa" w:w="6226"/>
             <w:tcBorders>
-              <w:top w:val="single" w:color="E0DDE8" w:sz="4"/>
-              <w:left w:val="single" w:color="E0DDE8" w:sz="4"/>
-              <w:bottom w:val="single" w:color="E0DDE8" w:sz="4"/>
-              <w:right w:val="single" w:color="E0DDE8" w:sz="4"/>
+              <w:top w:val="single" w:color="E5DDD4" w:sz="4"/>
+              <w:left w:val="single" w:color="E5DDD4" w:sz="4"/>
+              <w:bottom w:val="single" w:color="E5DDD4" w:sz="4"/>
+              <w:right w:val="single" w:color="E5DDD4" w:sz="4"/>
             </w:tcBorders>
             <w:tcMar>
               <w:top w:type="dxa" w:w="80"/>
@@ -310,10 +310,10 @@
           <w:tcPr>
             <w:tcW w:type="dxa" w:w="2800"/>
             <w:tcBorders>
-              <w:top w:val="single" w:color="E0DDE8" w:sz="4"/>
-              <w:left w:val="single" w:color="E0DDE8" w:sz="4"/>
-              <w:bottom w:val="single" w:color="E0DDE8" w:sz="4"/>
-              <w:right w:val="single" w:color="E0DDE8" w:sz="4"/>
+              <w:top w:val="single" w:color="E5DDD4" w:sz="4"/>
+              <w:left w:val="single" w:color="E5DDD4" w:sz="4"/>
+              <w:bottom w:val="single" w:color="E5DDD4" w:sz="4"/>
+              <w:right w:val="single" w:color="E5DDD4" w:sz="4"/>
             </w:tcBorders>
             <w:tcMar>
               <w:top w:type="dxa" w:w="80"/>
@@ -344,10 +344,10 @@
           <w:tcPr>
             <w:tcW w:type="dxa" w:w="6226"/>
             <w:tcBorders>
-              <w:top w:val="single" w:color="E0DDE8" w:sz="4"/>
-              <w:left w:val="single" w:color="E0DDE8" w:sz="4"/>
-              <w:bottom w:val="single" w:color="E0DDE8" w:sz="4"/>
-              <w:right w:val="single" w:color="E0DDE8" w:sz="4"/>
+              <w:top w:val="single" w:color="E5DDD4" w:sz="4"/>
+              <w:left w:val="single" w:color="E5DDD4" w:sz="4"/>
+              <w:bottom w:val="single" w:color="E5DDD4" w:sz="4"/>
+              <w:right w:val="single" w:color="E5DDD4" w:sz="4"/>
             </w:tcBorders>
             <w:tcMar>
               <w:top w:type="dxa" w:w="80"/>
@@ -380,10 +380,10 @@
           <w:tcPr>
             <w:tcW w:type="dxa" w:w="2800"/>
             <w:tcBorders>
-              <w:top w:val="single" w:color="E0DDE8" w:sz="4"/>
-              <w:left w:val="single" w:color="E0DDE8" w:sz="4"/>
-              <w:bottom w:val="single" w:color="E0DDE8" w:sz="4"/>
-              <w:right w:val="single" w:color="E0DDE8" w:sz="4"/>
+              <w:top w:val="single" w:color="E5DDD4" w:sz="4"/>
+              <w:left w:val="single" w:color="E5DDD4" w:sz="4"/>
+              <w:bottom w:val="single" w:color="E5DDD4" w:sz="4"/>
+              <w:right w:val="single" w:color="E5DDD4" w:sz="4"/>
             </w:tcBorders>
             <w:tcMar>
               <w:top w:type="dxa" w:w="80"/>
@@ -414,10 +414,10 @@
           <w:tcPr>
             <w:tcW w:type="dxa" w:w="6226"/>
             <w:tcBorders>
-              <w:top w:val="single" w:color="E0DDE8" w:sz="4"/>
-              <w:left w:val="single" w:color="E0DDE8" w:sz="4"/>
-              <w:bottom w:val="single" w:color="E0DDE8" w:sz="4"/>
-              <w:right w:val="single" w:color="E0DDE8" w:sz="4"/>
+              <w:top w:val="single" w:color="E5DDD4" w:sz="4"/>
+              <w:left w:val="single" w:color="E5DDD4" w:sz="4"/>
+              <w:bottom w:val="single" w:color="E5DDD4" w:sz="4"/>
+              <w:right w:val="single" w:color="E5DDD4" w:sz="4"/>
             </w:tcBorders>
             <w:tcMar>
               <w:top w:type="dxa" w:w="80"/>
@@ -450,10 +450,10 @@
           <w:tcPr>
             <w:tcW w:type="dxa" w:w="2800"/>
             <w:tcBorders>
-              <w:top w:val="single" w:color="E0DDE8" w:sz="4"/>
-              <w:left w:val="single" w:color="E0DDE8" w:sz="4"/>
-              <w:bottom w:val="single" w:color="E0DDE8" w:sz="4"/>
-              <w:right w:val="single" w:color="E0DDE8" w:sz="4"/>
+              <w:top w:val="single" w:color="E5DDD4" w:sz="4"/>
+              <w:left w:val="single" w:color="E5DDD4" w:sz="4"/>
+              <w:bottom w:val="single" w:color="E5DDD4" w:sz="4"/>
+              <w:right w:val="single" w:color="E5DDD4" w:sz="4"/>
             </w:tcBorders>
             <w:tcMar>
               <w:top w:type="dxa" w:w="80"/>
@@ -484,10 +484,10 @@
           <w:tcPr>
             <w:tcW w:type="dxa" w:w="6226"/>
             <w:tcBorders>
-              <w:top w:val="single" w:color="E0DDE8" w:sz="4"/>
-              <w:left w:val="single" w:color="E0DDE8" w:sz="4"/>
-              <w:bottom w:val="single" w:color="E0DDE8" w:sz="4"/>
-              <w:right w:val="single" w:color="E0DDE8" w:sz="4"/>
+              <w:top w:val="single" w:color="E5DDD4" w:sz="4"/>
+              <w:left w:val="single" w:color="E5DDD4" w:sz="4"/>
+              <w:bottom w:val="single" w:color="E5DDD4" w:sz="4"/>
+              <w:right w:val="single" w:color="E5DDD4" w:sz="4"/>
             </w:tcBorders>
             <w:tcMar>
               <w:top w:type="dxa" w:w="80"/>
@@ -520,10 +520,10 @@
           <w:tcPr>
             <w:tcW w:type="dxa" w:w="2800"/>
             <w:tcBorders>
-              <w:top w:val="single" w:color="E0DDE8" w:sz="4"/>
-              <w:left w:val="single" w:color="E0DDE8" w:sz="4"/>
-              <w:bottom w:val="single" w:color="E0DDE8" w:sz="4"/>
-              <w:right w:val="single" w:color="E0DDE8" w:sz="4"/>
+              <w:top w:val="single" w:color="E5DDD4" w:sz="4"/>
+              <w:left w:val="single" w:color="E5DDD4" w:sz="4"/>
+              <w:bottom w:val="single" w:color="E5DDD4" w:sz="4"/>
+              <w:right w:val="single" w:color="E5DDD4" w:sz="4"/>
             </w:tcBorders>
             <w:tcMar>
               <w:top w:type="dxa" w:w="80"/>
@@ -554,10 +554,10 @@
           <w:tcPr>
             <w:tcW w:type="dxa" w:w="6226"/>
             <w:tcBorders>
-              <w:top w:val="single" w:color="E0DDE8" w:sz="4"/>
-              <w:left w:val="single" w:color="E0DDE8" w:sz="4"/>
-              <w:bottom w:val="single" w:color="E0DDE8" w:sz="4"/>
-              <w:right w:val="single" w:color="E0DDE8" w:sz="4"/>
+              <w:top w:val="single" w:color="E5DDD4" w:sz="4"/>
+              <w:left w:val="single" w:color="E5DDD4" w:sz="4"/>
+              <w:bottom w:val="single" w:color="E5DDD4" w:sz="4"/>
+              <w:right w:val="single" w:color="E5DDD4" w:sz="4"/>
             </w:tcBorders>
             <w:tcMar>
               <w:top w:type="dxa" w:w="80"/>
@@ -590,10 +590,10 @@
           <w:tcPr>
             <w:tcW w:type="dxa" w:w="2800"/>
             <w:tcBorders>
-              <w:top w:val="single" w:color="E0DDE8" w:sz="4"/>
-              <w:left w:val="single" w:color="E0DDE8" w:sz="4"/>
-              <w:bottom w:val="single" w:color="E0DDE8" w:sz="4"/>
-              <w:right w:val="single" w:color="E0DDE8" w:sz="4"/>
+              <w:top w:val="single" w:color="E5DDD4" w:sz="4"/>
+              <w:left w:val="single" w:color="E5DDD4" w:sz="4"/>
+              <w:bottom w:val="single" w:color="E5DDD4" w:sz="4"/>
+              <w:right w:val="single" w:color="E5DDD4" w:sz="4"/>
             </w:tcBorders>
             <w:tcMar>
               <w:top w:type="dxa" w:w="80"/>
@@ -624,10 +624,10 @@
           <w:tcPr>
             <w:tcW w:type="dxa" w:w="6226"/>
             <w:tcBorders>
-              <w:top w:val="single" w:color="E0DDE8" w:sz="4"/>
-              <w:left w:val="single" w:color="E0DDE8" w:sz="4"/>
-              <w:bottom w:val="single" w:color="E0DDE8" w:sz="4"/>
-              <w:right w:val="single" w:color="E0DDE8" w:sz="4"/>
+              <w:top w:val="single" w:color="E5DDD4" w:sz="4"/>
+              <w:left w:val="single" w:color="E5DDD4" w:sz="4"/>
+              <w:bottom w:val="single" w:color="E5DDD4" w:sz="4"/>
+              <w:right w:val="single" w:color="E5DDD4" w:sz="4"/>
             </w:tcBorders>
             <w:tcMar>
               <w:top w:type="dxa" w:w="80"/>
@@ -660,10 +660,10 @@
           <w:tcPr>
             <w:tcW w:type="dxa" w:w="2800"/>
             <w:tcBorders>
-              <w:top w:val="single" w:color="E0DDE8" w:sz="4"/>
-              <w:left w:val="single" w:color="E0DDE8" w:sz="4"/>
-              <w:bottom w:val="single" w:color="E0DDE8" w:sz="4"/>
-              <w:right w:val="single" w:color="E0DDE8" w:sz="4"/>
+              <w:top w:val="single" w:color="E5DDD4" w:sz="4"/>
+              <w:left w:val="single" w:color="E5DDD4" w:sz="4"/>
+              <w:bottom w:val="single" w:color="E5DDD4" w:sz="4"/>
+              <w:right w:val="single" w:color="E5DDD4" w:sz="4"/>
             </w:tcBorders>
             <w:tcMar>
               <w:top w:type="dxa" w:w="80"/>
@@ -694,10 +694,10 @@
           <w:tcPr>
             <w:tcW w:type="dxa" w:w="6226"/>
             <w:tcBorders>
-              <w:top w:val="single" w:color="E0DDE8" w:sz="4"/>
-              <w:left w:val="single" w:color="E0DDE8" w:sz="4"/>
-              <w:bottom w:val="single" w:color="E0DDE8" w:sz="4"/>
-              <w:right w:val="single" w:color="E0DDE8" w:sz="4"/>
+              <w:top w:val="single" w:color="E5DDD4" w:sz="4"/>
+              <w:left w:val="single" w:color="E5DDD4" w:sz="4"/>
+              <w:bottom w:val="single" w:color="E5DDD4" w:sz="4"/>
+              <w:right w:val="single" w:color="E5DDD4" w:sz="4"/>
             </w:tcBorders>
             <w:tcMar>
               <w:top w:type="dxa" w:w="80"/>
@@ -730,10 +730,10 @@
           <w:tcPr>
             <w:tcW w:type="dxa" w:w="2800"/>
             <w:tcBorders>
-              <w:top w:val="single" w:color="E0DDE8" w:sz="4"/>
-              <w:left w:val="single" w:color="E0DDE8" w:sz="4"/>
-              <w:bottom w:val="single" w:color="E0DDE8" w:sz="4"/>
-              <w:right w:val="single" w:color="E0DDE8" w:sz="4"/>
+              <w:top w:val="single" w:color="E5DDD4" w:sz="4"/>
+              <w:left w:val="single" w:color="E5DDD4" w:sz="4"/>
+              <w:bottom w:val="single" w:color="E5DDD4" w:sz="4"/>
+              <w:right w:val="single" w:color="E5DDD4" w:sz="4"/>
             </w:tcBorders>
             <w:tcMar>
               <w:top w:type="dxa" w:w="80"/>
@@ -764,10 +764,10 @@
           <w:tcPr>
             <w:tcW w:type="dxa" w:w="6226"/>
             <w:tcBorders>
-              <w:top w:val="single" w:color="E0DDE8" w:sz="4"/>
-              <w:left w:val="single" w:color="E0DDE8" w:sz="4"/>
-              <w:bottom w:val="single" w:color="E0DDE8" w:sz="4"/>
-              <w:right w:val="single" w:color="E0DDE8" w:sz="4"/>
+              <w:top w:val="single" w:color="E5DDD4" w:sz="4"/>
+              <w:left w:val="single" w:color="E5DDD4" w:sz="4"/>
+              <w:bottom w:val="single" w:color="E5DDD4" w:sz="4"/>
+              <w:right w:val="single" w:color="E5DDD4" w:sz="4"/>
             </w:tcBorders>
             <w:tcMar>
               <w:top w:type="dxa" w:w="80"/>
@@ -800,10 +800,10 @@
           <w:tcPr>
             <w:tcW w:type="dxa" w:w="2800"/>
             <w:tcBorders>
-              <w:top w:val="single" w:color="E0DDE8" w:sz="4"/>
-              <w:left w:val="single" w:color="E0DDE8" w:sz="4"/>
-              <w:bottom w:val="single" w:color="E0DDE8" w:sz="4"/>
-              <w:right w:val="single" w:color="E0DDE8" w:sz="4"/>
+              <w:top w:val="single" w:color="E5DDD4" w:sz="4"/>
+              <w:left w:val="single" w:color="E5DDD4" w:sz="4"/>
+              <w:bottom w:val="single" w:color="E5DDD4" w:sz="4"/>
+              <w:right w:val="single" w:color="E5DDD4" w:sz="4"/>
             </w:tcBorders>
             <w:tcMar>
               <w:top w:type="dxa" w:w="80"/>
@@ -834,10 +834,10 @@
           <w:tcPr>
             <w:tcW w:type="dxa" w:w="6226"/>
             <w:tcBorders>
-              <w:top w:val="single" w:color="E0DDE8" w:sz="4"/>
-              <w:left w:val="single" w:color="E0DDE8" w:sz="4"/>
-              <w:bottom w:val="single" w:color="E0DDE8" w:sz="4"/>
-              <w:right w:val="single" w:color="E0DDE8" w:sz="4"/>
+              <w:top w:val="single" w:color="E5DDD4" w:sz="4"/>
+              <w:left w:val="single" w:color="E5DDD4" w:sz="4"/>
+              <w:bottom w:val="single" w:color="E5DDD4" w:sz="4"/>
+              <w:right w:val="single" w:color="E5DDD4" w:sz="4"/>
             </w:tcBorders>
             <w:tcMar>
               <w:top w:type="dxa" w:w="80"/>
@@ -881,7 +881,7 @@
           <w:rFonts w:ascii="Arial" w:cs="Arial" w:eastAsia="Arial" w:hAnsi="Arial"/>
           <w:b/>
           <w:bCs/>
-          <w:color w:val="2A2440"/>
+          <w:color w:val="2A0A1E"/>
           <w:sz w:val="32"/>
           <w:szCs w:val="32"/>
         </w:rPr>
@@ -890,13 +890,13 @@
     </w:p>
     <w:p>
       <w:pPr>
-        <w:shd w:fill="F5F4F9" w:val="clear"/>
+        <w:shd w:fill="FAF6F0" w:val="clear"/>
         <w:spacing w:after="40" w:before="40"/>
       </w:pPr>
       <w:r>
         <w:rPr>
           <w:rFonts w:ascii="Courier New" w:cs="Courier New" w:eastAsia="Courier New" w:hAnsi="Courier New"/>
-          <w:color w:val="2A2440"/>
+          <w:color w:val="2A0A1E"/>
           <w:sz w:val="18"/>
           <w:szCs w:val="18"/>
         </w:rPr>
@@ -905,13 +905,13 @@
     </w:p>
     <w:p>
       <w:pPr>
-        <w:shd w:fill="F5F4F9" w:val="clear"/>
+        <w:shd w:fill="FAF6F0" w:val="clear"/>
         <w:spacing w:after="40" w:before="40"/>
       </w:pPr>
       <w:r>
         <w:rPr>
           <w:rFonts w:ascii="Courier New" w:cs="Courier New" w:eastAsia="Courier New" w:hAnsi="Courier New"/>
-          <w:color w:val="2A2440"/>
+          <w:color w:val="2A0A1E"/>
           <w:sz w:val="18"/>
           <w:szCs w:val="18"/>
         </w:rPr>
@@ -920,13 +920,13 @@
     </w:p>
     <w:p>
       <w:pPr>
-        <w:shd w:fill="F5F4F9" w:val="clear"/>
+        <w:shd w:fill="FAF6F0" w:val="clear"/>
         <w:spacing w:after="40" w:before="40"/>
       </w:pPr>
       <w:r>
         <w:rPr>
           <w:rFonts w:ascii="Courier New" w:cs="Courier New" w:eastAsia="Courier New" w:hAnsi="Courier New"/>
-          <w:color w:val="2A2440"/>
+          <w:color w:val="2A0A1E"/>
           <w:sz w:val="18"/>
           <w:szCs w:val="18"/>
         </w:rPr>
@@ -935,13 +935,13 @@
     </w:p>
     <w:p>
       <w:pPr>
-        <w:shd w:fill="F5F4F9" w:val="clear"/>
+        <w:shd w:fill="FAF6F0" w:val="clear"/>
         <w:spacing w:after="40" w:before="40"/>
       </w:pPr>
       <w:r>
         <w:rPr>
           <w:rFonts w:ascii="Courier New" w:cs="Courier New" w:eastAsia="Courier New" w:hAnsi="Courier New"/>
-          <w:color w:val="2A2440"/>
+          <w:color w:val="2A0A1E"/>
           <w:sz w:val="18"/>
           <w:szCs w:val="18"/>
         </w:rPr>
@@ -950,13 +950,13 @@
     </w:p>
     <w:p>
       <w:pPr>
-        <w:shd w:fill="F5F4F9" w:val="clear"/>
+        <w:shd w:fill="FAF6F0" w:val="clear"/>
         <w:spacing w:after="40" w:before="40"/>
       </w:pPr>
       <w:r>
         <w:rPr>
           <w:rFonts w:ascii="Courier New" w:cs="Courier New" w:eastAsia="Courier New" w:hAnsi="Courier New"/>
-          <w:color w:val="2A2440"/>
+          <w:color w:val="2A0A1E"/>
           <w:sz w:val="18"/>
           <w:szCs w:val="18"/>
         </w:rPr>
@@ -965,13 +965,13 @@
     </w:p>
     <w:p>
       <w:pPr>
-        <w:shd w:fill="F5F4F9" w:val="clear"/>
+        <w:shd w:fill="FAF6F0" w:val="clear"/>
         <w:spacing w:after="40" w:before="40"/>
       </w:pPr>
       <w:r>
         <w:rPr>
           <w:rFonts w:ascii="Courier New" w:cs="Courier New" w:eastAsia="Courier New" w:hAnsi="Courier New"/>
-          <w:color w:val="2A2440"/>
+          <w:color w:val="2A0A1E"/>
           <w:sz w:val="18"/>
           <w:szCs w:val="18"/>
         </w:rPr>
@@ -980,13 +980,13 @@
     </w:p>
     <w:p>
       <w:pPr>
-        <w:shd w:fill="F5F4F9" w:val="clear"/>
+        <w:shd w:fill="FAF6F0" w:val="clear"/>
         <w:spacing w:after="40" w:before="40"/>
       </w:pPr>
       <w:r>
         <w:rPr>
           <w:rFonts w:ascii="Courier New" w:cs="Courier New" w:eastAsia="Courier New" w:hAnsi="Courier New"/>
-          <w:color w:val="2A2440"/>
+          <w:color w:val="2A0A1E"/>
           <w:sz w:val="18"/>
           <w:szCs w:val="18"/>
         </w:rPr>
@@ -995,13 +995,13 @@
     </w:p>
     <w:p>
       <w:pPr>
-        <w:shd w:fill="F5F4F9" w:val="clear"/>
+        <w:shd w:fill="FAF6F0" w:val="clear"/>
         <w:spacing w:after="40" w:before="40"/>
       </w:pPr>
       <w:r>
         <w:rPr>
           <w:rFonts w:ascii="Courier New" w:cs="Courier New" w:eastAsia="Courier New" w:hAnsi="Courier New"/>
-          <w:color w:val="2A2440"/>
+          <w:color w:val="2A0A1E"/>
           <w:sz w:val="18"/>
           <w:szCs w:val="18"/>
         </w:rPr>
@@ -1010,13 +1010,13 @@
     </w:p>
     <w:p>
       <w:pPr>
-        <w:shd w:fill="F5F4F9" w:val="clear"/>
+        <w:shd w:fill="FAF6F0" w:val="clear"/>
         <w:spacing w:after="40" w:before="40"/>
       </w:pPr>
       <w:r>
         <w:rPr>
           <w:rFonts w:ascii="Courier New" w:cs="Courier New" w:eastAsia="Courier New" w:hAnsi="Courier New"/>
-          <w:color w:val="2A2440"/>
+          <w:color w:val="2A0A1E"/>
           <w:sz w:val="18"/>
           <w:szCs w:val="18"/>
         </w:rPr>
@@ -1025,13 +1025,13 @@
     </w:p>
     <w:p>
       <w:pPr>
-        <w:shd w:fill="F5F4F9" w:val="clear"/>
+        <w:shd w:fill="FAF6F0" w:val="clear"/>
         <w:spacing w:after="40" w:before="40"/>
       </w:pPr>
       <w:r>
         <w:rPr>
           <w:rFonts w:ascii="Courier New" w:cs="Courier New" w:eastAsia="Courier New" w:hAnsi="Courier New"/>
-          <w:color w:val="2A2440"/>
+          <w:color w:val="2A0A1E"/>
           <w:sz w:val="18"/>
           <w:szCs w:val="18"/>
         </w:rPr>
@@ -1053,7 +1053,7 @@
           <w:rFonts w:ascii="Arial" w:cs="Arial" w:eastAsia="Arial" w:hAnsi="Arial"/>
           <w:b/>
           <w:bCs/>
-          <w:color w:val="2A2440"/>
+          <w:color w:val="2A0A1E"/>
           <w:sz w:val="32"/>
           <w:szCs w:val="32"/>
         </w:rPr>
@@ -1070,7 +1070,7 @@
           <w:rFonts w:ascii="Arial" w:cs="Arial" w:eastAsia="Arial" w:hAnsi="Arial"/>
           <w:b/>
           <w:bCs/>
-          <w:color w:val="7B6FA0"/>
+          <w:color w:val="6B4455"/>
           <w:sz w:val="26"/>
           <w:szCs w:val="26"/>
         </w:rPr>
@@ -1079,13 +1079,13 @@
     </w:p>
     <w:p>
       <w:pPr>
-        <w:shd w:fill="F5F4F9" w:val="clear"/>
+        <w:shd w:fill="FAF6F0" w:val="clear"/>
         <w:spacing w:after="40" w:before="40"/>
       </w:pPr>
       <w:r>
         <w:rPr>
           <w:rFonts w:ascii="Courier New" w:cs="Courier New" w:eastAsia="Courier New" w:hAnsi="Courier New"/>
-          <w:color w:val="2A2440"/>
+          <w:color w:val="2A0A1E"/>
           <w:sz w:val="18"/>
           <w:szCs w:val="18"/>
         </w:rPr>
@@ -1094,13 +1094,13 @@
     </w:p>
     <w:p>
       <w:pPr>
-        <w:shd w:fill="F5F4F9" w:val="clear"/>
+        <w:shd w:fill="FAF6F0" w:val="clear"/>
         <w:spacing w:after="40" w:before="40"/>
       </w:pPr>
       <w:r>
         <w:rPr>
           <w:rFonts w:ascii="Courier New" w:cs="Courier New" w:eastAsia="Courier New" w:hAnsi="Courier New"/>
-          <w:color w:val="2A2440"/>
+          <w:color w:val="2A0A1E"/>
           <w:sz w:val="18"/>
           <w:szCs w:val="18"/>
         </w:rPr>
@@ -1109,13 +1109,13 @@
     </w:p>
     <w:p>
       <w:pPr>
-        <w:shd w:fill="F5F4F9" w:val="clear"/>
+        <w:shd w:fill="FAF6F0" w:val="clear"/>
         <w:spacing w:after="40" w:before="40"/>
       </w:pPr>
       <w:r>
         <w:rPr>
           <w:rFonts w:ascii="Courier New" w:cs="Courier New" w:eastAsia="Courier New" w:hAnsi="Courier New"/>
-          <w:color w:val="2A2440"/>
+          <w:color w:val="2A0A1E"/>
           <w:sz w:val="18"/>
           <w:szCs w:val="18"/>
         </w:rPr>
@@ -1124,13 +1124,13 @@
     </w:p>
     <w:p>
       <w:pPr>
-        <w:shd w:fill="F5F4F9" w:val="clear"/>
+        <w:shd w:fill="FAF6F0" w:val="clear"/>
         <w:spacing w:after="40" w:before="40"/>
       </w:pPr>
       <w:r>
         <w:rPr>
           <w:rFonts w:ascii="Courier New" w:cs="Courier New" w:eastAsia="Courier New" w:hAnsi="Courier New"/>
-          <w:color w:val="2A2440"/>
+          <w:color w:val="2A0A1E"/>
           <w:sz w:val="18"/>
           <w:szCs w:val="18"/>
         </w:rPr>
@@ -1139,13 +1139,13 @@
     </w:p>
     <w:p>
       <w:pPr>
-        <w:shd w:fill="F5F4F9" w:val="clear"/>
+        <w:shd w:fill="FAF6F0" w:val="clear"/>
         <w:spacing w:after="40" w:before="40"/>
       </w:pPr>
       <w:r>
         <w:rPr>
           <w:rFonts w:ascii="Courier New" w:cs="Courier New" w:eastAsia="Courier New" w:hAnsi="Courier New"/>
-          <w:color w:val="2A2440"/>
+          <w:color w:val="2A0A1E"/>
           <w:sz w:val="18"/>
           <w:szCs w:val="18"/>
         </w:rPr>
@@ -1154,13 +1154,13 @@
     </w:p>
     <w:p>
       <w:pPr>
-        <w:shd w:fill="F5F4F9" w:val="clear"/>
+        <w:shd w:fill="FAF6F0" w:val="clear"/>
         <w:spacing w:after="40" w:before="40"/>
       </w:pPr>
       <w:r>
         <w:rPr>
           <w:rFonts w:ascii="Courier New" w:cs="Courier New" w:eastAsia="Courier New" w:hAnsi="Courier New"/>
-          <w:color w:val="2A2440"/>
+          <w:color w:val="2A0A1E"/>
           <w:sz w:val="18"/>
           <w:szCs w:val="18"/>
         </w:rPr>
@@ -1169,13 +1169,13 @@
     </w:p>
     <w:p>
       <w:pPr>
-        <w:shd w:fill="F5F4F9" w:val="clear"/>
+        <w:shd w:fill="FAF6F0" w:val="clear"/>
         <w:spacing w:after="40" w:before="40"/>
       </w:pPr>
       <w:r>
         <w:rPr>
           <w:rFonts w:ascii="Courier New" w:cs="Courier New" w:eastAsia="Courier New" w:hAnsi="Courier New"/>
-          <w:color w:val="2A2440"/>
+          <w:color w:val="2A0A1E"/>
           <w:sz w:val="18"/>
           <w:szCs w:val="18"/>
         </w:rPr>
@@ -1184,13 +1184,13 @@
     </w:p>
     <w:p>
       <w:pPr>
-        <w:shd w:fill="F5F4F9" w:val="clear"/>
+        <w:shd w:fill="FAF6F0" w:val="clear"/>
         <w:spacing w:after="40" w:before="40"/>
       </w:pPr>
       <w:r>
         <w:rPr>
           <w:rFonts w:ascii="Courier New" w:cs="Courier New" w:eastAsia="Courier New" w:hAnsi="Courier New"/>
-          <w:color w:val="2A2440"/>
+          <w:color w:val="2A0A1E"/>
           <w:sz w:val="18"/>
           <w:szCs w:val="18"/>
         </w:rPr>
@@ -1199,13 +1199,13 @@
     </w:p>
     <w:p>
       <w:pPr>
-        <w:shd w:fill="F5F4F9" w:val="clear"/>
+        <w:shd w:fill="FAF6F0" w:val="clear"/>
         <w:spacing w:after="40" w:before="40"/>
       </w:pPr>
       <w:r>
         <w:rPr>
           <w:rFonts w:ascii="Courier New" w:cs="Courier New" w:eastAsia="Courier New" w:hAnsi="Courier New"/>
-          <w:color w:val="2A2440"/>
+          <w:color w:val="2A0A1E"/>
           <w:sz w:val="18"/>
           <w:szCs w:val="18"/>
         </w:rPr>
@@ -1214,13 +1214,13 @@
     </w:p>
     <w:p>
       <w:pPr>
-        <w:shd w:fill="F5F4F9" w:val="clear"/>
+        <w:shd w:fill="FAF6F0" w:val="clear"/>
         <w:spacing w:after="40" w:before="40"/>
       </w:pPr>
       <w:r>
         <w:rPr>
           <w:rFonts w:ascii="Courier New" w:cs="Courier New" w:eastAsia="Courier New" w:hAnsi="Courier New"/>
-          <w:color w:val="2A2440"/>
+          <w:color w:val="2A0A1E"/>
           <w:sz w:val="18"/>
           <w:szCs w:val="18"/>
         </w:rPr>
@@ -1229,13 +1229,13 @@
     </w:p>
     <w:p>
       <w:pPr>
-        <w:shd w:fill="F5F4F9" w:val="clear"/>
+        <w:shd w:fill="FAF6F0" w:val="clear"/>
         <w:spacing w:after="40" w:before="40"/>
       </w:pPr>
       <w:r>
         <w:rPr>
           <w:rFonts w:ascii="Courier New" w:cs="Courier New" w:eastAsia="Courier New" w:hAnsi="Courier New"/>
-          <w:color w:val="2A2440"/>
+          <w:color w:val="2A0A1E"/>
           <w:sz w:val="18"/>
           <w:szCs w:val="18"/>
         </w:rPr>
@@ -1244,13 +1244,13 @@
     </w:p>
     <w:p>
       <w:pPr>
-        <w:shd w:fill="F5F4F9" w:val="clear"/>
+        <w:shd w:fill="FAF6F0" w:val="clear"/>
         <w:spacing w:after="40" w:before="40"/>
       </w:pPr>
       <w:r>
         <w:rPr>
           <w:rFonts w:ascii="Courier New" w:cs="Courier New" w:eastAsia="Courier New" w:hAnsi="Courier New"/>
-          <w:color w:val="2A2440"/>
+          <w:color w:val="2A0A1E"/>
           <w:sz w:val="18"/>
           <w:szCs w:val="18"/>
         </w:rPr>
@@ -1259,13 +1259,13 @@
     </w:p>
     <w:p>
       <w:pPr>
-        <w:shd w:fill="F5F4F9" w:val="clear"/>
+        <w:shd w:fill="FAF6F0" w:val="clear"/>
         <w:spacing w:after="40" w:before="40"/>
       </w:pPr>
       <w:r>
         <w:rPr>
           <w:rFonts w:ascii="Courier New" w:cs="Courier New" w:eastAsia="Courier New" w:hAnsi="Courier New"/>
-          <w:color w:val="2A2440"/>
+          <w:color w:val="2A0A1E"/>
           <w:sz w:val="18"/>
           <w:szCs w:val="18"/>
         </w:rPr>
@@ -1274,13 +1274,13 @@
     </w:p>
     <w:p>
       <w:pPr>
-        <w:shd w:fill="F5F4F9" w:val="clear"/>
+        <w:shd w:fill="FAF6F0" w:val="clear"/>
         <w:spacing w:after="40" w:before="40"/>
       </w:pPr>
       <w:r>
         <w:rPr>
           <w:rFonts w:ascii="Courier New" w:cs="Courier New" w:eastAsia="Courier New" w:hAnsi="Courier New"/>
-          <w:color w:val="2A2440"/>
+          <w:color w:val="2A0A1E"/>
           <w:sz w:val="18"/>
           <w:szCs w:val="18"/>
         </w:rPr>
@@ -1289,13 +1289,13 @@
     </w:p>
     <w:p>
       <w:pPr>
-        <w:shd w:fill="F5F4F9" w:val="clear"/>
+        <w:shd w:fill="FAF6F0" w:val="clear"/>
         <w:spacing w:after="40" w:before="40"/>
       </w:pPr>
       <w:r>
         <w:rPr>
           <w:rFonts w:ascii="Courier New" w:cs="Courier New" w:eastAsia="Courier New" w:hAnsi="Courier New"/>
-          <w:color w:val="2A2440"/>
+          <w:color w:val="2A0A1E"/>
           <w:sz w:val="18"/>
           <w:szCs w:val="18"/>
         </w:rPr>
@@ -1304,13 +1304,13 @@
     </w:p>
     <w:p>
       <w:pPr>
-        <w:shd w:fill="F5F4F9" w:val="clear"/>
+        <w:shd w:fill="FAF6F0" w:val="clear"/>
         <w:spacing w:after="40" w:before="40"/>
       </w:pPr>
       <w:r>
         <w:rPr>
           <w:rFonts w:ascii="Courier New" w:cs="Courier New" w:eastAsia="Courier New" w:hAnsi="Courier New"/>
-          <w:color w:val="2A2440"/>
+          <w:color w:val="2A0A1E"/>
           <w:sz w:val="18"/>
           <w:szCs w:val="18"/>
         </w:rPr>
@@ -1319,13 +1319,13 @@
     </w:p>
     <w:p>
       <w:pPr>
-        <w:shd w:fill="F5F4F9" w:val="clear"/>
+        <w:shd w:fill="FAF6F0" w:val="clear"/>
         <w:spacing w:after="40" w:before="40"/>
       </w:pPr>
       <w:r>
         <w:rPr>
           <w:rFonts w:ascii="Courier New" w:cs="Courier New" w:eastAsia="Courier New" w:hAnsi="Courier New"/>
-          <w:color w:val="2A2440"/>
+          <w:color w:val="2A0A1E"/>
           <w:sz w:val="18"/>
           <w:szCs w:val="18"/>
         </w:rPr>
@@ -1347,7 +1347,7 @@
           <w:rFonts w:ascii="Arial" w:cs="Arial" w:eastAsia="Arial" w:hAnsi="Arial"/>
           <w:b/>
           <w:bCs/>
-          <w:color w:val="7B6FA0"/>
+          <w:color w:val="6B4455"/>
           <w:sz w:val="26"/>
           <w:szCs w:val="26"/>
         </w:rPr>
@@ -1471,7 +1471,7 @@
           <w:rFonts w:ascii="Arial" w:cs="Arial" w:eastAsia="Arial" w:hAnsi="Arial"/>
           <w:b/>
           <w:bCs/>
-          <w:color w:val="2A2440"/>
+          <w:color w:val="2A0A1E"/>
           <w:sz w:val="32"/>
           <w:szCs w:val="32"/>
         </w:rPr>
@@ -1488,7 +1488,7 @@
           <w:rFonts w:ascii="Arial" w:cs="Arial" w:eastAsia="Arial" w:hAnsi="Arial"/>
           <w:b/>
           <w:bCs/>
-          <w:color w:val="7B6FA0"/>
+          <w:color w:val="6B4455"/>
           <w:sz w:val="26"/>
           <w:szCs w:val="26"/>
         </w:rPr>
@@ -1523,7 +1523,7 @@
           <w:rFonts w:ascii="Arial" w:cs="Arial" w:eastAsia="Arial" w:hAnsi="Arial"/>
           <w:b/>
           <w:bCs/>
-          <w:color w:val="2A2440"/>
+          <w:color w:val="2A0A1E"/>
           <w:sz w:val="22"/>
           <w:szCs w:val="22"/>
         </w:rPr>
@@ -1635,7 +1635,7 @@
           <w:rFonts w:ascii="Arial" w:cs="Arial" w:eastAsia="Arial" w:hAnsi="Arial"/>
           <w:b/>
           <w:bCs/>
-          <w:color w:val="2A2440"/>
+          <w:color w:val="2A0A1E"/>
           <w:sz w:val="22"/>
           <w:szCs w:val="22"/>
         </w:rPr>
@@ -1670,7 +1670,7 @@
           <w:rFonts w:ascii="Arial" w:cs="Arial" w:eastAsia="Arial" w:hAnsi="Arial"/>
           <w:b/>
           <w:bCs/>
-          <w:color w:val="2A2440"/>
+          <w:color w:val="2A0A1E"/>
           <w:sz w:val="22"/>
           <w:szCs w:val="22"/>
         </w:rPr>
@@ -1764,7 +1764,7 @@
           <w:rFonts w:ascii="Arial" w:cs="Arial" w:eastAsia="Arial" w:hAnsi="Arial"/>
           <w:b/>
           <w:bCs/>
-          <w:color w:val="2A2440"/>
+          <w:color w:val="2A0A1E"/>
           <w:sz w:val="22"/>
           <w:szCs w:val="22"/>
         </w:rPr>
@@ -1799,7 +1799,7 @@
           <w:rFonts w:ascii="Arial" w:cs="Arial" w:eastAsia="Arial" w:hAnsi="Arial"/>
           <w:b/>
           <w:bCs/>
-          <w:color w:val="7B6FA0"/>
+          <w:color w:val="6B4455"/>
           <w:sz w:val="26"/>
           <w:szCs w:val="26"/>
         </w:rPr>
@@ -1834,7 +1834,7 @@
           <w:rFonts w:ascii="Arial" w:cs="Arial" w:eastAsia="Arial" w:hAnsi="Arial"/>
           <w:b/>
           <w:bCs/>
-          <w:color w:val="2A2440"/>
+          <w:color w:val="2A0A1E"/>
           <w:sz w:val="22"/>
           <w:szCs w:val="22"/>
         </w:rPr>
@@ -1946,7 +1946,7 @@
           <w:rFonts w:ascii="Arial" w:cs="Arial" w:eastAsia="Arial" w:hAnsi="Arial"/>
           <w:b/>
           <w:bCs/>
-          <w:color w:val="7B6FA0"/>
+          <w:color w:val="6B4455"/>
           <w:sz w:val="26"/>
           <w:szCs w:val="26"/>
         </w:rPr>
@@ -1963,7 +1963,7 @@
           <w:sz w:val="20"/>
           <w:szCs w:val="20"/>
         </w:rPr>
-        <w:t xml:space="preserve">Users can attach a photo via the camera icon in the input bar. Wini can read wine labels, wine lists, and menus.</w:t>
+        <w:t xml:space="preserve">Users can attach one or more photos via the camera icon in the input bar. Wini can read wine labels, wine lists, and menus, and can reason across multiple photos in the same message — e.g. a label plus a wine list, or several bottles to compare. No per-message photo limit is enforced during closed beta.</w:t>
       </w:r>
     </w:p>
     <w:p>
@@ -1981,7 +1981,7 @@
           <w:rFonts w:ascii="Arial" w:cs="Arial" w:eastAsia="Arial" w:hAnsi="Arial"/>
           <w:b/>
           <w:bCs/>
-          <w:color w:val="2A2440"/>
+          <w:color w:val="2A0A1E"/>
           <w:sz w:val="22"/>
           <w:szCs w:val="22"/>
         </w:rPr>
@@ -2003,61 +2003,167 @@
           <w:sz w:val="20"/>
           <w:szCs w:val="20"/>
         </w:rPr>
-        <w:t xml:space="preserve">Camera icon triggers a file input (accept="image/*")</w:t>
-      </w:r>
-    </w:p>
-    <w:p>
-      <w:pPr>
-        <w:pStyle w:val="ListParagraph"/>
-        <w:numPr>
-          <w:ilvl w:val="0"/>
-          <w:numId w:val="2"/>
-        </w:numPr>
-        <w:spacing w:after="60" w:before="0"/>
-      </w:pPr>
-      <w:r>
-        <w:rPr>
-          <w:rFonts w:ascii="Arial" w:cs="Arial" w:eastAsia="Arial" w:hAnsi="Arial"/>
-          <w:sz w:val="20"/>
-          <w:szCs w:val="20"/>
-        </w:rPr>
-        <w:t xml:space="preserve">On selection, the image is drawn onto a hidden canvas and resized to max 1024px on the longest side at 85% JPEG quality — keeps payloads under Vercel’s 4.5MB body limit</w:t>
-      </w:r>
-    </w:p>
-    <w:p>
-      <w:pPr>
-        <w:pStyle w:val="ListParagraph"/>
-        <w:numPr>
-          <w:ilvl w:val="0"/>
-          <w:numId w:val="2"/>
-        </w:numPr>
-        <w:spacing w:after="60" w:before="0"/>
-      </w:pPr>
-      <w:r>
-        <w:rPr>
-          <w:rFonts w:ascii="Arial" w:cs="Arial" w:eastAsia="Arial" w:hAnsi="Arial"/>
-          <w:sz w:val="20"/>
-          <w:szCs w:val="20"/>
-        </w:rPr>
-        <w:t xml:space="preserve">The base64-encoded image is appended to the message content array as { type: "image", source: { type: "base64", media_type, data } }</w:t>
-      </w:r>
-    </w:p>
-    <w:p>
-      <w:pPr>
-        <w:pStyle w:val="ListParagraph"/>
-        <w:numPr>
-          <w:ilvl w:val="0"/>
-          <w:numId w:val="2"/>
-        </w:numPr>
-        <w:spacing w:after="60" w:before="0"/>
-      </w:pPr>
-      <w:r>
-        <w:rPr>
-          <w:rFonts w:ascii="Arial" w:cs="Arial" w:eastAsia="Arial" w:hAnsi="Arial"/>
-          <w:sz w:val="20"/>
-          <w:szCs w:val="20"/>
-        </w:rPr>
-        <w:t xml:space="preserve">Sent to /api/chat alongside the text message; Claude handles multimodal input natively</w:t>
+        <w:t xml:space="preserve">File input accepts multiple files (accept="image/*" multiple) — select several at once, or attach repeatedly before sending</w:t>
+      </w:r>
+    </w:p>
+    <w:p>
+      <w:pPr>
+        <w:pStyle w:val="ListParagraph"/>
+        <w:numPr>
+          <w:ilvl w:val="0"/>
+          <w:numId w:val="2"/>
+        </w:numPr>
+        <w:spacing w:after="60" w:before="0"/>
+      </w:pPr>
+      <w:r>
+        <w:rPr>
+          <w:rFonts w:ascii="Arial" w:cs="Arial" w:eastAsia="Arial" w:hAnsi="Arial"/>
+          <w:sz w:val="20"/>
+          <w:szCs w:val="20"/>
+        </w:rPr>
+        <w:t xml:space="preserve">Each file is run individually through the same resize pipeline: drawn onto a hidden canvas, resized to max 1024px on the longest side, encoded at 85% JPEG quality</w:t>
+      </w:r>
+    </w:p>
+    <w:p>
+      <w:pPr>
+        <w:pStyle w:val="ListParagraph"/>
+        <w:numPr>
+          <w:ilvl w:val="0"/>
+          <w:numId w:val="2"/>
+        </w:numPr>
+        <w:spacing w:after="60" w:before="0"/>
+      </w:pPr>
+      <w:r>
+        <w:rPr>
+          <w:rFonts w:ascii="Arial" w:cs="Arial" w:eastAsia="Arial" w:hAnsi="Arial"/>
+          <w:sz w:val="20"/>
+          <w:szCs w:val="20"/>
+        </w:rPr>
+        <w:t xml:space="preserve">Attached photos show as a row of thumbnails above the input bar, each with its own remove button, so nothing is sent unreviewed</w:t>
+      </w:r>
+    </w:p>
+    <w:p>
+      <w:pPr>
+        <w:pStyle w:val="ListParagraph"/>
+        <w:numPr>
+          <w:ilvl w:val="0"/>
+          <w:numId w:val="2"/>
+        </w:numPr>
+        <w:spacing w:after="60" w:before="0"/>
+      </w:pPr>
+      <w:r>
+        <w:rPr>
+          <w:rFonts w:ascii="Arial" w:cs="Arial" w:eastAsia="Arial" w:hAnsi="Arial"/>
+          <w:sz w:val="20"/>
+          <w:szCs w:val="20"/>
+        </w:rPr>
+        <w:t xml:space="preserve">Each image becomes its own { type: "image", source: { type: "base64", media_type, data } } block; all image blocks plus the optional text block are appended to the same message content array</w:t>
+      </w:r>
+    </w:p>
+    <w:p>
+      <w:pPr>
+        <w:pStyle w:val="ListParagraph"/>
+        <w:numPr>
+          <w:ilvl w:val="0"/>
+          <w:numId w:val="2"/>
+        </w:numPr>
+        <w:spacing w:after="60" w:before="0"/>
+      </w:pPr>
+      <w:r>
+        <w:rPr>
+          <w:rFonts w:ascii="Arial" w:cs="Arial" w:eastAsia="Arial" w:hAnsi="Arial"/>
+          <w:sz w:val="20"/>
+          <w:szCs w:val="20"/>
+        </w:rPr>
+        <w:t xml:space="preserve">Sent to /api/chat alongside the text message; Claude handles multimodal input with any number of images natively — api/chat.js required no changes, since it passes the incoming messages array straight through with no assumption about content array length</w:t>
+      </w:r>
+    </w:p>
+    <w:p>
+      <w:pPr>
+        <w:pStyle w:val="ListParagraph"/>
+        <w:numPr>
+          <w:ilvl w:val="0"/>
+          <w:numId w:val="2"/>
+        </w:numPr>
+        <w:spacing w:after="60" w:before="0"/>
+      </w:pPr>
+      <w:r>
+        <w:rPr>
+          <w:rFonts w:ascii="Arial" w:cs="Arial" w:eastAsia="Arial" w:hAnsi="Arial"/>
+          <w:sz w:val="20"/>
+          <w:szCs w:val="20"/>
+        </w:rPr>
+        <w:t xml:space="preserve">The system prompt’s READING PHOTOS section explicitly covers mixed photo types in one message: treat each on its own terms, then connect them if the connection is obvious, without forcing a single verdict across unrelated images</w:t>
+      </w:r>
+    </w:p>
+    <w:p>
+      <w:pPr>
+        <w:spacing w:after="30" w:before="0"/>
+      </w:pPr>
+    </w:p>
+    <w:p>
+      <w:pPr>
+        <w:pStyle w:val="Heading3"/>
+        <w:spacing w:after="80" w:before="200"/>
+      </w:pPr>
+      <w:r>
+        <w:rPr>
+          <w:rFonts w:ascii="Arial" w:cs="Arial" w:eastAsia="Arial" w:hAnsi="Arial"/>
+          <w:b/>
+          <w:bCs/>
+          <w:color w:val="2A0A1E"/>
+          <w:sz w:val="22"/>
+          <w:szCs w:val="22"/>
+        </w:rPr>
+        <w:t xml:space="preserve">Payload Size Safety Check</w:t>
+      </w:r>
+    </w:p>
+    <w:p>
+      <w:pPr>
+        <w:spacing w:after="100" w:before="0"/>
+      </w:pPr>
+      <w:r>
+        <w:rPr>
+          <w:rFonts w:ascii="Arial" w:cs="Arial" w:eastAsia="Arial" w:hAnsi="Arial"/>
+          <w:sz w:val="20"/>
+          <w:szCs w:val="20"/>
+        </w:rPr>
+        <w:t xml:space="preserve">Vercel’s request body limit is 4.5MB, and it applies to the entire POST body — including the full accumulated session history, not just the photos in the current message. Before sending, the frontend estimates the full prospective request body size (estimatePayloadSize()); a soft warning appears near the thumbnails as the estimate approaches the safety margin, and sending is hard-blocked with a clear message if it would exceed it, instead of failing with an opaque server error.</w:t>
+      </w:r>
+    </w:p>
+    <w:p>
+      <w:pPr>
+        <w:spacing w:after="30" w:before="0"/>
+      </w:pPr>
+    </w:p>
+    <w:p>
+      <w:pPr>
+        <w:pStyle w:val="Heading3"/>
+        <w:spacing w:after="80" w:before="200"/>
+      </w:pPr>
+      <w:r>
+        <w:rPr>
+          <w:rFonts w:ascii="Arial" w:cs="Arial" w:eastAsia="Arial" w:hAnsi="Arial"/>
+          <w:b/>
+          <w:bCs/>
+          <w:color w:val="2A0A1E"/>
+          <w:sz w:val="22"/>
+          <w:szCs w:val="22"/>
+        </w:rPr>
+        <w:t xml:space="preserve">Bubble Rendering</w:t>
+      </w:r>
+    </w:p>
+    <w:p>
+      <w:pPr>
+        <w:spacing w:after="100" w:before="0"/>
+      </w:pPr>
+      <w:r>
+        <w:rPr>
+          <w:rFonts w:ascii="Arial" w:cs="Arial" w:eastAsia="Arial" w:hAnsi="Arial"/>
+          <w:sz w:val="20"/>
+          <w:szCs w:val="20"/>
+        </w:rPr>
+        <w:t xml:space="preserve">Message bubbles render one or more images inside a wrapping container. Single-photo messages keep their original full-width sizing (no regression); multi-photo messages use a capped thumbnail grid (max-width: 160px per image) so several photos don’t blow out the bubble width.</w:t>
       </w:r>
     </w:p>
     <w:p>
@@ -2075,7 +2181,7 @@
           <w:rFonts w:ascii="Arial" w:cs="Arial" w:eastAsia="Arial" w:hAnsi="Arial"/>
           <w:b/>
           <w:bCs/>
-          <w:color w:val="7B6FA0"/>
+          <w:color w:val="6B4455"/>
           <w:sz w:val="26"/>
           <w:szCs w:val="26"/>
         </w:rPr>
@@ -2110,7 +2216,7 @@
           <w:rFonts w:ascii="Arial" w:cs="Arial" w:eastAsia="Arial" w:hAnsi="Arial"/>
           <w:b/>
           <w:bCs/>
-          <w:color w:val="2A2440"/>
+          <w:color w:val="2A0A1E"/>
           <w:sz w:val="22"/>
           <w:szCs w:val="22"/>
         </w:rPr>
@@ -2145,7 +2251,7 @@
           <w:rFonts w:ascii="Arial" w:cs="Arial" w:eastAsia="Arial" w:hAnsi="Arial"/>
           <w:b/>
           <w:bCs/>
-          <w:color w:val="2A2440"/>
+          <w:color w:val="2A0A1E"/>
           <w:sz w:val="22"/>
           <w:szCs w:val="22"/>
         </w:rPr>
@@ -2180,7 +2286,7 @@
           <w:rFonts w:ascii="Arial" w:cs="Arial" w:eastAsia="Arial" w:hAnsi="Arial"/>
           <w:b/>
           <w:bCs/>
-          <w:color w:val="7B6FA0"/>
+          <w:color w:val="6B4455"/>
           <w:sz w:val="26"/>
           <w:szCs w:val="26"/>
         </w:rPr>
@@ -2215,7 +2321,7 @@
           <w:rFonts w:ascii="Arial" w:cs="Arial" w:eastAsia="Arial" w:hAnsi="Arial"/>
           <w:b/>
           <w:bCs/>
-          <w:color w:val="2A2440"/>
+          <w:color w:val="2A0A1E"/>
           <w:sz w:val="22"/>
           <w:szCs w:val="22"/>
         </w:rPr>
@@ -2378,7 +2484,7 @@
           <w:rFonts w:ascii="Arial" w:cs="Arial" w:eastAsia="Arial" w:hAnsi="Arial"/>
           <w:b/>
           <w:bCs/>
-          <w:color w:val="7B6FA0"/>
+          <w:color w:val="6B4455"/>
           <w:sz w:val="26"/>
           <w:szCs w:val="26"/>
         </w:rPr>
@@ -2413,7 +2519,7 @@
           <w:rFonts w:ascii="Arial" w:cs="Arial" w:eastAsia="Arial" w:hAnsi="Arial"/>
           <w:b/>
           <w:bCs/>
-          <w:color w:val="2A2440"/>
+          <w:color w:val="2A0A1E"/>
           <w:sz w:val="22"/>
           <w:szCs w:val="22"/>
         </w:rPr>
@@ -2507,7 +2613,7 @@
           <w:rFonts w:ascii="Arial" w:cs="Arial" w:eastAsia="Arial" w:hAnsi="Arial"/>
           <w:b/>
           <w:bCs/>
-          <w:color w:val="2A2440"/>
+          <w:color w:val="2A0A1E"/>
           <w:sz w:val="22"/>
           <w:szCs w:val="22"/>
         </w:rPr>
@@ -2516,13 +2622,13 @@
     </w:p>
     <w:p>
       <w:pPr>
-        <w:shd w:fill="F5F4F9" w:val="clear"/>
+        <w:shd w:fill="FAF6F0" w:val="clear"/>
         <w:spacing w:after="40" w:before="40"/>
       </w:pPr>
       <w:r>
         <w:rPr>
           <w:rFonts w:ascii="Courier New" w:cs="Courier New" w:eastAsia="Courier New" w:hAnsi="Courier New"/>
-          <w:color w:val="2A2440"/>
+          <w:color w:val="2A0A1E"/>
           <w:sz w:val="18"/>
           <w:szCs w:val="18"/>
         </w:rPr>
@@ -2531,13 +2637,13 @@
     </w:p>
     <w:p>
       <w:pPr>
-        <w:shd w:fill="F5F4F9" w:val="clear"/>
+        <w:shd w:fill="FAF6F0" w:val="clear"/>
         <w:spacing w:after="40" w:before="40"/>
       </w:pPr>
       <w:r>
         <w:rPr>
           <w:rFonts w:ascii="Courier New" w:cs="Courier New" w:eastAsia="Courier New" w:hAnsi="Courier New"/>
-          <w:color w:val="2A2440"/>
+          <w:color w:val="2A0A1E"/>
           <w:sz w:val="18"/>
           <w:szCs w:val="18"/>
         </w:rPr>
@@ -2572,7 +2678,7 @@
           <w:rFonts w:ascii="Arial" w:cs="Arial" w:eastAsia="Arial" w:hAnsi="Arial"/>
           <w:b/>
           <w:bCs/>
-          <w:color w:val="7B6FA0"/>
+          <w:color w:val="6B4455"/>
           <w:sz w:val="26"/>
           <w:szCs w:val="26"/>
         </w:rPr>
@@ -2607,7 +2713,7 @@
           <w:rFonts w:ascii="Arial" w:cs="Arial" w:eastAsia="Arial" w:hAnsi="Arial"/>
           <w:b/>
           <w:bCs/>
-          <w:color w:val="2A2440"/>
+          <w:color w:val="2A0A1E"/>
           <w:sz w:val="22"/>
           <w:szCs w:val="22"/>
         </w:rPr>
@@ -2719,7 +2825,7 @@
           <w:rFonts w:ascii="Arial" w:cs="Arial" w:eastAsia="Arial" w:hAnsi="Arial"/>
           <w:b/>
           <w:bCs/>
-          <w:color w:val="2A2440"/>
+          <w:color w:val="2A0A1E"/>
           <w:sz w:val="22"/>
           <w:szCs w:val="22"/>
         </w:rPr>
@@ -2754,7 +2860,7 @@
           <w:rFonts w:ascii="Arial" w:cs="Arial" w:eastAsia="Arial" w:hAnsi="Arial"/>
           <w:b/>
           <w:bCs/>
-          <w:color w:val="2A2440"/>
+          <w:color w:val="2A0A1E"/>
           <w:sz w:val="22"/>
           <w:szCs w:val="22"/>
         </w:rPr>
@@ -2763,13 +2869,13 @@
     </w:p>
     <w:p>
       <w:pPr>
-        <w:shd w:fill="F5F4F9" w:val="clear"/>
+        <w:shd w:fill="FAF6F0" w:val="clear"/>
         <w:spacing w:after="40" w:before="40"/>
       </w:pPr>
       <w:r>
         <w:rPr>
           <w:rFonts w:ascii="Courier New" w:cs="Courier New" w:eastAsia="Courier New" w:hAnsi="Courier New"/>
-          <w:color w:val="2A2440"/>
+          <w:color w:val="2A0A1E"/>
           <w:sz w:val="18"/>
           <w:szCs w:val="18"/>
         </w:rPr>
@@ -2804,7 +2910,7 @@
           <w:rFonts w:ascii="Arial" w:cs="Arial" w:eastAsia="Arial" w:hAnsi="Arial"/>
           <w:b/>
           <w:bCs/>
-          <w:color w:val="2A2440"/>
+          <w:color w:val="2A0A1E"/>
           <w:sz w:val="22"/>
           <w:szCs w:val="22"/>
         </w:rPr>
@@ -2821,7 +2927,7 @@
           <w:sz w:val="20"/>
           <w:szCs w:val="20"/>
         </w:rPr>
-        <w:t xml:space="preserve">Every exit path in extract-palate.js now logs a distinct message — successful upsert, upsert failure, unparseable model output, or nothing-extracted — so failures are diagnosable from Vercel function logs alone, without needing a browser network trace. The handler always returns 200 to the client regardless of outcome (fire-and-forget from the frontend’s perspective); failures are visible only server-side, by design.</w:t>
+        <w:t xml:space="preserve">Every exit path in extract-palate.js now logs a distinct message — successful upsert, upsert failure, unparseable model output, or nothing-extracted — so failures are diagnosable from Vercel function logs alone, without needing a browser network trace. The handler always returns 200 to the client regardless of outcome; failures are visible only server-side, by design.</w:t>
       </w:r>
     </w:p>
     <w:p>
@@ -2839,7 +2945,7 @@
           <w:rFonts w:ascii="Arial" w:cs="Arial" w:eastAsia="Arial" w:hAnsi="Arial"/>
           <w:b/>
           <w:bCs/>
-          <w:color w:val="2A2440"/>
+          <w:color w:val="2A0A1E"/>
           <w:sz w:val="22"/>
           <w:szCs w:val="22"/>
         </w:rPr>
@@ -2861,43 +2967,43 @@
           <w:sz w:val="20"/>
           <w:szCs w:val="20"/>
         </w:rPr>
-        <w:t xml:space="preserve">.single() on the initial profile read threw a 406 for any user with no existing row (i.e. every new user’s first message), which was caught by the outer try/catch and exited before extraction or the upsert ever ran. Fixed by switching to .maybeSingle(), which returns null instead of throwing. The same pattern existed in chat.js’s profile fetch (silently swallowed there, so no user-visible symptom, but same noisy-log issue) — fixed identically.</w:t>
-      </w:r>
-    </w:p>
-    <w:p>
-      <w:pPr>
-        <w:pStyle w:val="ListParagraph"/>
-        <w:numPr>
-          <w:ilvl w:val="0"/>
-          <w:numId w:val="2"/>
-        </w:numPr>
-        <w:spacing w:after="60" w:before="0"/>
-      </w:pPr>
-      <w:r>
-        <w:rPr>
-          <w:rFonts w:ascii="Arial" w:cs="Arial" w:eastAsia="Arial" w:hAnsi="Arial"/>
-          <w:sz w:val="20"/>
-          <w:szCs w:val="20"/>
-        </w:rPr>
-        <w:t xml:space="preserve">Separately, the upsert result was never checked — supabase-js returns errors on the result object rather than throwing, so a failed upsert looked identical to a successful one in the logs. Fixed by checking { error } on the upsert and logging it explicitly.</w:t>
-      </w:r>
-    </w:p>
-    <w:p>
-      <w:pPr>
-        <w:pStyle w:val="ListParagraph"/>
-        <w:numPr>
-          <w:ilvl w:val="0"/>
-          <w:numId w:val="2"/>
-        </w:numPr>
-        <w:spacing w:after="60" w:before="0"/>
-      </w:pPr>
-      <w:r>
-        <w:rPr>
-          <w:rFonts w:ascii="Arial" w:cs="Arial" w:eastAsia="Arial" w:hAnsi="Arial"/>
-          <w:sz w:val="20"/>
-          <w:szCs w:val="20"/>
-        </w:rPr>
-        <w:t xml:space="preserve">Root cause of the actual empty-table symptom: SUPABASE_SERVICE_ROLE_KEY was missing from Vercel’s environment variables (only SUPABASE_ANON_KEY and SUPABASE_URL were set). createClient() throws "supabaseKey is required" when the key is undefined — this affected extract-palate.js, the profile-fetch in chat.js, and delete-account.js simultaneously, since all three depend on it. Adding the key in Vercel and redeploying resolved it.</w:t>
+        <w:t xml:space="preserve">.single() on the initial profile read threw a 406 for any user with no existing row, caught by the outer try/catch and exited before extraction or the upsert ever ran. Fixed by switching to .maybeSingle(). The same pattern existed in chat.js’s profile fetch — fixed identically.</w:t>
+      </w:r>
+    </w:p>
+    <w:p>
+      <w:pPr>
+        <w:pStyle w:val="ListParagraph"/>
+        <w:numPr>
+          <w:ilvl w:val="0"/>
+          <w:numId w:val="2"/>
+        </w:numPr>
+        <w:spacing w:after="60" w:before="0"/>
+      </w:pPr>
+      <w:r>
+        <w:rPr>
+          <w:rFonts w:ascii="Arial" w:cs="Arial" w:eastAsia="Arial" w:hAnsi="Arial"/>
+          <w:sz w:val="20"/>
+          <w:szCs w:val="20"/>
+        </w:rPr>
+        <w:t xml:space="preserve">The upsert result was never checked — supabase-js returns errors on the result object rather than throwing, so a failed upsert looked identical to a successful one in the logs. Fixed by checking { error } on the upsert and logging it explicitly.</w:t>
+      </w:r>
+    </w:p>
+    <w:p>
+      <w:pPr>
+        <w:pStyle w:val="ListParagraph"/>
+        <w:numPr>
+          <w:ilvl w:val="0"/>
+          <w:numId w:val="2"/>
+        </w:numPr>
+        <w:spacing w:after="60" w:before="0"/>
+      </w:pPr>
+      <w:r>
+        <w:rPr>
+          <w:rFonts w:ascii="Arial" w:cs="Arial" w:eastAsia="Arial" w:hAnsi="Arial"/>
+          <w:sz w:val="20"/>
+          <w:szCs w:val="20"/>
+        </w:rPr>
+        <w:t xml:space="preserve">Root cause of the actual empty-table symptom: SUPABASE_SERVICE_ROLE_KEY was missing from Vercel’s environment variables. This affected extract-palate.js, the profile-fetch in chat.js, and delete-account.js simultaneously. Adding the key in Vercel and redeploying resolved it.</w:t>
       </w:r>
     </w:p>
     <w:p>
@@ -2915,7 +3021,7 @@
           <w:rFonts w:ascii="Arial" w:cs="Arial" w:eastAsia="Arial" w:hAnsi="Arial"/>
           <w:b/>
           <w:bCs/>
-          <w:color w:val="7B6FA0"/>
+          <w:color w:val="6B4455"/>
           <w:sz w:val="26"/>
           <w:szCs w:val="26"/>
         </w:rPr>
@@ -2950,7 +3056,7 @@
           <w:rFonts w:ascii="Arial" w:cs="Arial" w:eastAsia="Arial" w:hAnsi="Arial"/>
           <w:b/>
           <w:bCs/>
-          <w:color w:val="2A2440"/>
+          <w:color w:val="2A0A1E"/>
           <w:sz w:val="22"/>
           <w:szCs w:val="22"/>
         </w:rPr>
@@ -3008,7 +3114,42 @@
           <w:sz w:val="20"/>
           <w:szCs w:val="20"/>
         </w:rPr>
-        <w:t xml:space="preserve">Cascade deletes handle associated conversations, messages, and palate_profile rows (configured in Supabase dashboard)</w:t>
+        <w:t xml:space="preserve">conversations, palate_profile, and messages foreign keys reference auth.users (directly, or transitively via conversations) with ON DELETE CASCADE — required for deleteUser() to succeed for any user with saved data</w:t>
+      </w:r>
+    </w:p>
+    <w:p>
+      <w:pPr>
+        <w:spacing w:after="30" w:before="0"/>
+      </w:pPr>
+    </w:p>
+    <w:p>
+      <w:pPr>
+        <w:pStyle w:val="Heading3"/>
+        <w:spacing w:after="80" w:before="200"/>
+      </w:pPr>
+      <w:r>
+        <w:rPr>
+          <w:rFonts w:ascii="Arial" w:cs="Arial" w:eastAsia="Arial" w:hAnsi="Arial"/>
+          <w:b/>
+          <w:bCs/>
+          <w:color w:val="2A0A1E"/>
+          <w:sz w:val="22"/>
+          <w:szCs w:val="22"/>
+        </w:rPr>
+        <w:t xml:space="preserve">Post-Delete UX</w:t>
+      </w:r>
+    </w:p>
+    <w:p>
+      <w:pPr>
+        <w:spacing w:after="100" w:before="0"/>
+      </w:pPr>
+      <w:r>
+        <w:rPr>
+          <w:rFonts w:ascii="Arial" w:cs="Arial" w:eastAsia="Arial" w:hAnsi="Arial"/>
+          <w:sz w:val="20"/>
+          <w:szCs w:val="20"/>
+        </w:rPr>
+        <w:t xml:space="preserve">On success, the frontend clears chat/session state and shows a success overlay (checkmark, confirmation message, "Start a new chat" button) rather than leaving an empty, unseeded chat behind. Dismissing the overlay — via the button, the close icon, or a backdrop click — always calls init() afterward, the same seeding call used on normal boot, so Wini’s opening greeting fires fresh.</w:t>
       </w:r>
     </w:p>
     <w:p>
@@ -3026,7 +3167,7 @@
           <w:rFonts w:ascii="Arial" w:cs="Arial" w:eastAsia="Arial" w:hAnsi="Arial"/>
           <w:b/>
           <w:bCs/>
-          <w:color w:val="7B6FA0"/>
+          <w:color w:val="6B4455"/>
           <w:sz w:val="26"/>
           <w:szCs w:val="26"/>
         </w:rPr>
@@ -3053,13 +3194,13 @@
     </w:p>
     <w:p>
       <w:pPr>
-        <w:shd w:fill="F5F4F9" w:val="clear"/>
+        <w:shd w:fill="FAF6F0" w:val="clear"/>
         <w:spacing w:after="40" w:before="40"/>
       </w:pPr>
       <w:r>
         <w:rPr>
           <w:rFonts w:ascii="Courier New" w:cs="Courier New" w:eastAsia="Courier New" w:hAnsi="Courier New"/>
-          <w:color w:val="2A2440"/>
+          <w:color w:val="2A0A1E"/>
           <w:sz w:val="18"/>
           <w:szCs w:val="18"/>
         </w:rPr>
@@ -3081,7 +3222,7 @@
           <w:rFonts w:ascii="Arial" w:cs="Arial" w:eastAsia="Arial" w:hAnsi="Arial"/>
           <w:b/>
           <w:bCs/>
-          <w:color w:val="2A2440"/>
+          <w:color w:val="2A0A1E"/>
           <w:sz w:val="32"/>
           <w:szCs w:val="32"/>
         </w:rPr>
@@ -3131,12 +3272,12 @@
           <w:tcPr>
             <w:tcW w:type="dxa" w:w="2500"/>
             <w:tcBorders>
-              <w:top w:val="single" w:color="E0DDE8" w:sz="4"/>
-              <w:left w:val="single" w:color="E0DDE8" w:sz="4"/>
-              <w:bottom w:val="single" w:color="E0DDE8" w:sz="4"/>
-              <w:right w:val="single" w:color="E0DDE8" w:sz="4"/>
+              <w:top w:val="single" w:color="E5DDD4" w:sz="4"/>
+              <w:left w:val="single" w:color="E5DDD4" w:sz="4"/>
+              <w:bottom w:val="single" w:color="E5DDD4" w:sz="4"/>
+              <w:right w:val="single" w:color="E5DDD4" w:sz="4"/>
             </w:tcBorders>
-            <w:shd w:fill="2A2440" w:val="clear"/>
+            <w:shd w:fill="2A0A1E" w:val="clear"/>
             <w:tcMar>
               <w:top w:type="dxa" w:w="80"/>
               <w:left w:type="dxa" w:w="150"/>
@@ -3166,12 +3307,12 @@
           <w:tcPr>
             <w:tcW w:type="dxa" w:w="2200"/>
             <w:tcBorders>
-              <w:top w:val="single" w:color="E0DDE8" w:sz="4"/>
-              <w:left w:val="single" w:color="E0DDE8" w:sz="4"/>
-              <w:bottom w:val="single" w:color="E0DDE8" w:sz="4"/>
-              <w:right w:val="single" w:color="E0DDE8" w:sz="4"/>
+              <w:top w:val="single" w:color="E5DDD4" w:sz="4"/>
+              <w:left w:val="single" w:color="E5DDD4" w:sz="4"/>
+              <w:bottom w:val="single" w:color="E5DDD4" w:sz="4"/>
+              <w:right w:val="single" w:color="E5DDD4" w:sz="4"/>
             </w:tcBorders>
-            <w:shd w:fill="2A2440" w:val="clear"/>
+            <w:shd w:fill="2A0A1E" w:val="clear"/>
             <w:tcMar>
               <w:top w:type="dxa" w:w="80"/>
               <w:left w:type="dxa" w:w="150"/>
@@ -3201,12 +3342,12 @@
           <w:tcPr>
             <w:tcW w:type="dxa" w:w="4326"/>
             <w:tcBorders>
-              <w:top w:val="single" w:color="E0DDE8" w:sz="4"/>
-              <w:left w:val="single" w:color="E0DDE8" w:sz="4"/>
-              <w:bottom w:val="single" w:color="E0DDE8" w:sz="4"/>
-              <w:right w:val="single" w:color="E0DDE8" w:sz="4"/>
+              <w:top w:val="single" w:color="E5DDD4" w:sz="4"/>
+              <w:left w:val="single" w:color="E5DDD4" w:sz="4"/>
+              <w:bottom w:val="single" w:color="E5DDD4" w:sz="4"/>
+              <w:right w:val="single" w:color="E5DDD4" w:sz="4"/>
             </w:tcBorders>
-            <w:shd w:fill="2A2440" w:val="clear"/>
+            <w:shd w:fill="2A0A1E" w:val="clear"/>
             <w:tcMar>
               <w:top w:type="dxa" w:w="80"/>
               <w:left w:type="dxa" w:w="150"/>
@@ -3238,10 +3379,10 @@
           <w:tcPr>
             <w:tcW w:type="dxa" w:w="2500"/>
             <w:tcBorders>
-              <w:top w:val="single" w:color="E0DDE8" w:sz="4"/>
-              <w:left w:val="single" w:color="E0DDE8" w:sz="4"/>
-              <w:bottom w:val="single" w:color="E0DDE8" w:sz="4"/>
-              <w:right w:val="single" w:color="E0DDE8" w:sz="4"/>
+              <w:top w:val="single" w:color="E5DDD4" w:sz="4"/>
+              <w:left w:val="single" w:color="E5DDD4" w:sz="4"/>
+              <w:bottom w:val="single" w:color="E5DDD4" w:sz="4"/>
+              <w:right w:val="single" w:color="E5DDD4" w:sz="4"/>
             </w:tcBorders>
             <w:tcMar>
               <w:top w:type="dxa" w:w="80"/>
@@ -3272,10 +3413,10 @@
           <w:tcPr>
             <w:tcW w:type="dxa" w:w="2200"/>
             <w:tcBorders>
-              <w:top w:val="single" w:color="E0DDE8" w:sz="4"/>
-              <w:left w:val="single" w:color="E0DDE8" w:sz="4"/>
-              <w:bottom w:val="single" w:color="E0DDE8" w:sz="4"/>
-              <w:right w:val="single" w:color="E0DDE8" w:sz="4"/>
+              <w:top w:val="single" w:color="E5DDD4" w:sz="4"/>
+              <w:left w:val="single" w:color="E5DDD4" w:sz="4"/>
+              <w:bottom w:val="single" w:color="E5DDD4" w:sz="4"/>
+              <w:right w:val="single" w:color="E5DDD4" w:sz="4"/>
             </w:tcBorders>
             <w:tcMar>
               <w:top w:type="dxa" w:w="80"/>
@@ -3306,10 +3447,10 @@
           <w:tcPr>
             <w:tcW w:type="dxa" w:w="4326"/>
             <w:tcBorders>
-              <w:top w:val="single" w:color="E0DDE8" w:sz="4"/>
-              <w:left w:val="single" w:color="E0DDE8" w:sz="4"/>
-              <w:bottom w:val="single" w:color="E0DDE8" w:sz="4"/>
-              <w:right w:val="single" w:color="E0DDE8" w:sz="4"/>
+              <w:top w:val="single" w:color="E5DDD4" w:sz="4"/>
+              <w:left w:val="single" w:color="E5DDD4" w:sz="4"/>
+              <w:bottom w:val="single" w:color="E5DDD4" w:sz="4"/>
+              <w:right w:val="single" w:color="E5DDD4" w:sz="4"/>
             </w:tcBorders>
             <w:tcMar>
               <w:top w:type="dxa" w:w="80"/>
@@ -3342,10 +3483,10 @@
           <w:tcPr>
             <w:tcW w:type="dxa" w:w="2500"/>
             <w:tcBorders>
-              <w:top w:val="single" w:color="E0DDE8" w:sz="4"/>
-              <w:left w:val="single" w:color="E0DDE8" w:sz="4"/>
-              <w:bottom w:val="single" w:color="E0DDE8" w:sz="4"/>
-              <w:right w:val="single" w:color="E0DDE8" w:sz="4"/>
+              <w:top w:val="single" w:color="E5DDD4" w:sz="4"/>
+              <w:left w:val="single" w:color="E5DDD4" w:sz="4"/>
+              <w:bottom w:val="single" w:color="E5DDD4" w:sz="4"/>
+              <w:right w:val="single" w:color="E5DDD4" w:sz="4"/>
             </w:tcBorders>
             <w:tcMar>
               <w:top w:type="dxa" w:w="80"/>
@@ -3376,10 +3517,10 @@
           <w:tcPr>
             <w:tcW w:type="dxa" w:w="2200"/>
             <w:tcBorders>
-              <w:top w:val="single" w:color="E0DDE8" w:sz="4"/>
-              <w:left w:val="single" w:color="E0DDE8" w:sz="4"/>
-              <w:bottom w:val="single" w:color="E0DDE8" w:sz="4"/>
-              <w:right w:val="single" w:color="E0DDE8" w:sz="4"/>
+              <w:top w:val="single" w:color="E5DDD4" w:sz="4"/>
+              <w:left w:val="single" w:color="E5DDD4" w:sz="4"/>
+              <w:bottom w:val="single" w:color="E5DDD4" w:sz="4"/>
+              <w:right w:val="single" w:color="E5DDD4" w:sz="4"/>
             </w:tcBorders>
             <w:tcMar>
               <w:top w:type="dxa" w:w="80"/>
@@ -3410,10 +3551,10 @@
           <w:tcPr>
             <w:tcW w:type="dxa" w:w="4326"/>
             <w:tcBorders>
-              <w:top w:val="single" w:color="E0DDE8" w:sz="4"/>
-              <w:left w:val="single" w:color="E0DDE8" w:sz="4"/>
-              <w:bottom w:val="single" w:color="E0DDE8" w:sz="4"/>
-              <w:right w:val="single" w:color="E0DDE8" w:sz="4"/>
+              <w:top w:val="single" w:color="E5DDD4" w:sz="4"/>
+              <w:left w:val="single" w:color="E5DDD4" w:sz="4"/>
+              <w:bottom w:val="single" w:color="E5DDD4" w:sz="4"/>
+              <w:right w:val="single" w:color="E5DDD4" w:sz="4"/>
             </w:tcBorders>
             <w:tcMar>
               <w:top w:type="dxa" w:w="80"/>
@@ -3446,10 +3587,10 @@
           <w:tcPr>
             <w:tcW w:type="dxa" w:w="2500"/>
             <w:tcBorders>
-              <w:top w:val="single" w:color="E0DDE8" w:sz="4"/>
-              <w:left w:val="single" w:color="E0DDE8" w:sz="4"/>
-              <w:bottom w:val="single" w:color="E0DDE8" w:sz="4"/>
-              <w:right w:val="single" w:color="E0DDE8" w:sz="4"/>
+              <w:top w:val="single" w:color="E5DDD4" w:sz="4"/>
+              <w:left w:val="single" w:color="E5DDD4" w:sz="4"/>
+              <w:bottom w:val="single" w:color="E5DDD4" w:sz="4"/>
+              <w:right w:val="single" w:color="E5DDD4" w:sz="4"/>
             </w:tcBorders>
             <w:tcMar>
               <w:top w:type="dxa" w:w="80"/>
@@ -3480,10 +3621,10 @@
           <w:tcPr>
             <w:tcW w:type="dxa" w:w="2200"/>
             <w:tcBorders>
-              <w:top w:val="single" w:color="E0DDE8" w:sz="4"/>
-              <w:left w:val="single" w:color="E0DDE8" w:sz="4"/>
-              <w:bottom w:val="single" w:color="E0DDE8" w:sz="4"/>
-              <w:right w:val="single" w:color="E0DDE8" w:sz="4"/>
+              <w:top w:val="single" w:color="E5DDD4" w:sz="4"/>
+              <w:left w:val="single" w:color="E5DDD4" w:sz="4"/>
+              <w:bottom w:val="single" w:color="E5DDD4" w:sz="4"/>
+              <w:right w:val="single" w:color="E5DDD4" w:sz="4"/>
             </w:tcBorders>
             <w:tcMar>
               <w:top w:type="dxa" w:w="80"/>
@@ -3514,10 +3655,10 @@
           <w:tcPr>
             <w:tcW w:type="dxa" w:w="4326"/>
             <w:tcBorders>
-              <w:top w:val="single" w:color="E0DDE8" w:sz="4"/>
-              <w:left w:val="single" w:color="E0DDE8" w:sz="4"/>
-              <w:bottom w:val="single" w:color="E0DDE8" w:sz="4"/>
-              <w:right w:val="single" w:color="E0DDE8" w:sz="4"/>
+              <w:top w:val="single" w:color="E5DDD4" w:sz="4"/>
+              <w:left w:val="single" w:color="E5DDD4" w:sz="4"/>
+              <w:bottom w:val="single" w:color="E5DDD4" w:sz="4"/>
+              <w:right w:val="single" w:color="E5DDD4" w:sz="4"/>
             </w:tcBorders>
             <w:tcMar>
               <w:top w:type="dxa" w:w="80"/>
@@ -3550,10 +3691,10 @@
           <w:tcPr>
             <w:tcW w:type="dxa" w:w="2500"/>
             <w:tcBorders>
-              <w:top w:val="single" w:color="E0DDE8" w:sz="4"/>
-              <w:left w:val="single" w:color="E0DDE8" w:sz="4"/>
-              <w:bottom w:val="single" w:color="E0DDE8" w:sz="4"/>
-              <w:right w:val="single" w:color="E0DDE8" w:sz="4"/>
+              <w:top w:val="single" w:color="E5DDD4" w:sz="4"/>
+              <w:left w:val="single" w:color="E5DDD4" w:sz="4"/>
+              <w:bottom w:val="single" w:color="E5DDD4" w:sz="4"/>
+              <w:right w:val="single" w:color="E5DDD4" w:sz="4"/>
             </w:tcBorders>
             <w:tcMar>
               <w:top w:type="dxa" w:w="80"/>
@@ -3584,10 +3725,10 @@
           <w:tcPr>
             <w:tcW w:type="dxa" w:w="2200"/>
             <w:tcBorders>
-              <w:top w:val="single" w:color="E0DDE8" w:sz="4"/>
-              <w:left w:val="single" w:color="E0DDE8" w:sz="4"/>
-              <w:bottom w:val="single" w:color="E0DDE8" w:sz="4"/>
-              <w:right w:val="single" w:color="E0DDE8" w:sz="4"/>
+              <w:top w:val="single" w:color="E5DDD4" w:sz="4"/>
+              <w:left w:val="single" w:color="E5DDD4" w:sz="4"/>
+              <w:bottom w:val="single" w:color="E5DDD4" w:sz="4"/>
+              <w:right w:val="single" w:color="E5DDD4" w:sz="4"/>
             </w:tcBorders>
             <w:tcMar>
               <w:top w:type="dxa" w:w="80"/>
@@ -3618,10 +3759,10 @@
           <w:tcPr>
             <w:tcW w:type="dxa" w:w="4326"/>
             <w:tcBorders>
-              <w:top w:val="single" w:color="E0DDE8" w:sz="4"/>
-              <w:left w:val="single" w:color="E0DDE8" w:sz="4"/>
-              <w:bottom w:val="single" w:color="E0DDE8" w:sz="4"/>
-              <w:right w:val="single" w:color="E0DDE8" w:sz="4"/>
+              <w:top w:val="single" w:color="E5DDD4" w:sz="4"/>
+              <w:left w:val="single" w:color="E5DDD4" w:sz="4"/>
+              <w:bottom w:val="single" w:color="E5DDD4" w:sz="4"/>
+              <w:right w:val="single" w:color="E5DDD4" w:sz="4"/>
             </w:tcBorders>
             <w:tcMar>
               <w:top w:type="dxa" w:w="80"/>
@@ -3685,7 +3826,7 @@
           <w:rFonts w:ascii="Arial" w:cs="Arial" w:eastAsia="Arial" w:hAnsi="Arial"/>
           <w:b/>
           <w:bCs/>
-          <w:color w:val="2A2440"/>
+          <w:color w:val="2A0A1E"/>
           <w:sz w:val="32"/>
           <w:szCs w:val="32"/>
         </w:rPr>
@@ -3931,7 +4072,7 @@
           <w:rFonts w:ascii="Arial" w:cs="Arial" w:eastAsia="Arial" w:hAnsi="Arial"/>
           <w:b/>
           <w:bCs/>
-          <w:color w:val="2A2440"/>
+          <w:color w:val="2A0A1E"/>
           <w:sz w:val="32"/>
           <w:szCs w:val="32"/>
         </w:rPr>
@@ -3980,12 +4121,12 @@
           <w:tcPr>
             <w:tcW w:type="dxa" w:w="3500"/>
             <w:tcBorders>
-              <w:top w:val="single" w:color="E0DDE8" w:sz="4"/>
-              <w:left w:val="single" w:color="E0DDE8" w:sz="4"/>
-              <w:bottom w:val="single" w:color="E0DDE8" w:sz="4"/>
-              <w:right w:val="single" w:color="E0DDE8" w:sz="4"/>
+              <w:top w:val="single" w:color="E5DDD4" w:sz="4"/>
+              <w:left w:val="single" w:color="E5DDD4" w:sz="4"/>
+              <w:bottom w:val="single" w:color="E5DDD4" w:sz="4"/>
+              <w:right w:val="single" w:color="E5DDD4" w:sz="4"/>
             </w:tcBorders>
-            <w:shd w:fill="2A2440" w:val="clear"/>
+            <w:shd w:fill="2A0A1E" w:val="clear"/>
             <w:tcMar>
               <w:top w:type="dxa" w:w="80"/>
               <w:left w:type="dxa" w:w="150"/>
@@ -4015,12 +4156,12 @@
           <w:tcPr>
             <w:tcW w:type="dxa" w:w="5526"/>
             <w:tcBorders>
-              <w:top w:val="single" w:color="E0DDE8" w:sz="4"/>
-              <w:left w:val="single" w:color="E0DDE8" w:sz="4"/>
-              <w:bottom w:val="single" w:color="E0DDE8" w:sz="4"/>
-              <w:right w:val="single" w:color="E0DDE8" w:sz="4"/>
+              <w:top w:val="single" w:color="E5DDD4" w:sz="4"/>
+              <w:left w:val="single" w:color="E5DDD4" w:sz="4"/>
+              <w:bottom w:val="single" w:color="E5DDD4" w:sz="4"/>
+              <w:right w:val="single" w:color="E5DDD4" w:sz="4"/>
             </w:tcBorders>
-            <w:shd w:fill="2A2440" w:val="clear"/>
+            <w:shd w:fill="2A0A1E" w:val="clear"/>
             <w:tcMar>
               <w:top w:type="dxa" w:w="80"/>
               <w:left w:type="dxa" w:w="150"/>
@@ -4052,10 +4193,10 @@
           <w:tcPr>
             <w:tcW w:type="dxa" w:w="3500"/>
             <w:tcBorders>
-              <w:top w:val="single" w:color="E0DDE8" w:sz="4"/>
-              <w:left w:val="single" w:color="E0DDE8" w:sz="4"/>
-              <w:bottom w:val="single" w:color="E0DDE8" w:sz="4"/>
-              <w:right w:val="single" w:color="E0DDE8" w:sz="4"/>
+              <w:top w:val="single" w:color="E5DDD4" w:sz="4"/>
+              <w:left w:val="single" w:color="E5DDD4" w:sz="4"/>
+              <w:bottom w:val="single" w:color="E5DDD4" w:sz="4"/>
+              <w:right w:val="single" w:color="E5DDD4" w:sz="4"/>
             </w:tcBorders>
             <w:tcMar>
               <w:top w:type="dxa" w:w="80"/>
@@ -4086,10 +4227,10 @@
           <w:tcPr>
             <w:tcW w:type="dxa" w:w="5526"/>
             <w:tcBorders>
-              <w:top w:val="single" w:color="E0DDE8" w:sz="4"/>
-              <w:left w:val="single" w:color="E0DDE8" w:sz="4"/>
-              <w:bottom w:val="single" w:color="E0DDE8" w:sz="4"/>
-              <w:right w:val="single" w:color="E0DDE8" w:sz="4"/>
+              <w:top w:val="single" w:color="E5DDD4" w:sz="4"/>
+              <w:left w:val="single" w:color="E5DDD4" w:sz="4"/>
+              <w:bottom w:val="single" w:color="E5DDD4" w:sz="4"/>
+              <w:right w:val="single" w:color="E5DDD4" w:sz="4"/>
             </w:tcBorders>
             <w:tcMar>
               <w:top w:type="dxa" w:w="80"/>
@@ -4122,10 +4263,10 @@
           <w:tcPr>
             <w:tcW w:type="dxa" w:w="3500"/>
             <w:tcBorders>
-              <w:top w:val="single" w:color="E0DDE8" w:sz="4"/>
-              <w:left w:val="single" w:color="E0DDE8" w:sz="4"/>
-              <w:bottom w:val="single" w:color="E0DDE8" w:sz="4"/>
-              <w:right w:val="single" w:color="E0DDE8" w:sz="4"/>
+              <w:top w:val="single" w:color="E5DDD4" w:sz="4"/>
+              <w:left w:val="single" w:color="E5DDD4" w:sz="4"/>
+              <w:bottom w:val="single" w:color="E5DDD4" w:sz="4"/>
+              <w:right w:val="single" w:color="E5DDD4" w:sz="4"/>
             </w:tcBorders>
             <w:tcMar>
               <w:top w:type="dxa" w:w="80"/>
@@ -4156,10 +4297,10 @@
           <w:tcPr>
             <w:tcW w:type="dxa" w:w="5526"/>
             <w:tcBorders>
-              <w:top w:val="single" w:color="E0DDE8" w:sz="4"/>
-              <w:left w:val="single" w:color="E0DDE8" w:sz="4"/>
-              <w:bottom w:val="single" w:color="E0DDE8" w:sz="4"/>
-              <w:right w:val="single" w:color="E0DDE8" w:sz="4"/>
+              <w:top w:val="single" w:color="E5DDD4" w:sz="4"/>
+              <w:left w:val="single" w:color="E5DDD4" w:sz="4"/>
+              <w:bottom w:val="single" w:color="E5DDD4" w:sz="4"/>
+              <w:right w:val="single" w:color="E5DDD4" w:sz="4"/>
             </w:tcBorders>
             <w:tcMar>
               <w:top w:type="dxa" w:w="80"/>
@@ -4192,10 +4333,10 @@
           <w:tcPr>
             <w:tcW w:type="dxa" w:w="3500"/>
             <w:tcBorders>
-              <w:top w:val="single" w:color="E0DDE8" w:sz="4"/>
-              <w:left w:val="single" w:color="E0DDE8" w:sz="4"/>
-              <w:bottom w:val="single" w:color="E0DDE8" w:sz="4"/>
-              <w:right w:val="single" w:color="E0DDE8" w:sz="4"/>
+              <w:top w:val="single" w:color="E5DDD4" w:sz="4"/>
+              <w:left w:val="single" w:color="E5DDD4" w:sz="4"/>
+              <w:bottom w:val="single" w:color="E5DDD4" w:sz="4"/>
+              <w:right w:val="single" w:color="E5DDD4" w:sz="4"/>
             </w:tcBorders>
             <w:tcMar>
               <w:top w:type="dxa" w:w="80"/>
@@ -4226,10 +4367,10 @@
           <w:tcPr>
             <w:tcW w:type="dxa" w:w="5526"/>
             <w:tcBorders>
-              <w:top w:val="single" w:color="E0DDE8" w:sz="4"/>
-              <w:left w:val="single" w:color="E0DDE8" w:sz="4"/>
-              <w:bottom w:val="single" w:color="E0DDE8" w:sz="4"/>
-              <w:right w:val="single" w:color="E0DDE8" w:sz="4"/>
+              <w:top w:val="single" w:color="E5DDD4" w:sz="4"/>
+              <w:left w:val="single" w:color="E5DDD4" w:sz="4"/>
+              <w:bottom w:val="single" w:color="E5DDD4" w:sz="4"/>
+              <w:right w:val="single" w:color="E5DDD4" w:sz="4"/>
             </w:tcBorders>
             <w:tcMar>
               <w:top w:type="dxa" w:w="80"/>
@@ -4262,10 +4403,10 @@
           <w:tcPr>
             <w:tcW w:type="dxa" w:w="3500"/>
             <w:tcBorders>
-              <w:top w:val="single" w:color="E0DDE8" w:sz="4"/>
-              <w:left w:val="single" w:color="E0DDE8" w:sz="4"/>
-              <w:bottom w:val="single" w:color="E0DDE8" w:sz="4"/>
-              <w:right w:val="single" w:color="E0DDE8" w:sz="4"/>
+              <w:top w:val="single" w:color="E5DDD4" w:sz="4"/>
+              <w:left w:val="single" w:color="E5DDD4" w:sz="4"/>
+              <w:bottom w:val="single" w:color="E5DDD4" w:sz="4"/>
+              <w:right w:val="single" w:color="E5DDD4" w:sz="4"/>
             </w:tcBorders>
             <w:tcMar>
               <w:top w:type="dxa" w:w="80"/>
@@ -4296,10 +4437,10 @@
           <w:tcPr>
             <w:tcW w:type="dxa" w:w="5526"/>
             <w:tcBorders>
-              <w:top w:val="single" w:color="E0DDE8" w:sz="4"/>
-              <w:left w:val="single" w:color="E0DDE8" w:sz="4"/>
-              <w:bottom w:val="single" w:color="E0DDE8" w:sz="4"/>
-              <w:right w:val="single" w:color="E0DDE8" w:sz="4"/>
+              <w:top w:val="single" w:color="E5DDD4" w:sz="4"/>
+              <w:left w:val="single" w:color="E5DDD4" w:sz="4"/>
+              <w:bottom w:val="single" w:color="E5DDD4" w:sz="4"/>
+              <w:right w:val="single" w:color="E5DDD4" w:sz="4"/>
             </w:tcBorders>
             <w:tcMar>
               <w:top w:type="dxa" w:w="80"/>
@@ -4343,7 +4484,7 @@
           <w:rFonts w:ascii="Arial" w:cs="Arial" w:eastAsia="Arial" w:hAnsi="Arial"/>
           <w:b/>
           <w:bCs/>
-          <w:color w:val="2A2440"/>
+          <w:color w:val="2A0A1E"/>
           <w:sz w:val="32"/>
           <w:szCs w:val="32"/>
         </w:rPr>
@@ -4375,7 +4516,7 @@
           <w:sz w:val="20"/>
           <w:szCs w:val="20"/>
         </w:rPr>
-        <w:t xml:space="preserve"> — Supabase server-side token exchange failing intermittently. Likely cause: Google Client Secret mismatch or app in Testing mode in Google Console. Fix: regenerate Client Secret in Google Console and re-enter in Supabase Auth settings. Status unconfirmed — needs re-testing.</w:t>
+        <w:t xml:space="preserve"> — Supabase server-side token exchange failing intermittently. Likely cause: Google Client Secret mismatch or app in Testing mode in Google Console. Status unconfirmed — needs re-testing.</w:t>
       </w:r>
     </w:p>
     <w:p>
@@ -4404,6 +4545,34 @@
           <w:szCs w:val="20"/>
         </w:rPr>
         <w:t xml:space="preserve"> — The UI for browsing and loading past saved conversations is not yet built. Persistence (save) works; retrieval UI is a future feature.</w:t>
+      </w:r>
+    </w:p>
+    <w:p>
+      <w:pPr>
+        <w:pStyle w:val="ListParagraph"/>
+        <w:numPr>
+          <w:ilvl w:val="0"/>
+          <w:numId w:val="2"/>
+        </w:numPr>
+        <w:spacing w:after="60" w:before="0"/>
+      </w:pPr>
+      <w:r>
+        <w:rPr>
+          <w:rFonts w:ascii="Arial" w:cs="Arial" w:eastAsia="Arial" w:hAnsi="Arial"/>
+          <w:b/>
+          <w:bCs/>
+          <w:sz w:val="20"/>
+          <w:szCs w:val="20"/>
+        </w:rPr>
+        <w:t xml:space="preserve">Session hydration race in boot()</w:t>
+      </w:r>
+      <w:r>
+        <w:rPr>
+          <w:rFonts w:ascii="Arial" w:cs="Arial" w:eastAsia="Arial" w:hAnsi="Arial"/>
+          <w:sz w:val="20"/>
+          <w:szCs w:val="20"/>
+        </w:rPr>
+        <w:t xml:space="preserve"> — initSupabase() registers the onAuthStateChange listener but returns without waiting for its first callback to fire. boot() then immediately calls init(), which reads currentUser?.id for the seeded greeting. On a fresh page load or OAuth-redirect reload, currentUser can still be null at that moment, so the greeting is sent with userId: null and the palate-profile fetch is skipped for that call. Confirmed via code inspection; not yet fixed.</w:t>
       </w:r>
     </w:p>
     <w:p>
@@ -4421,7 +4590,7 @@
           <w:rFonts w:ascii="Arial" w:cs="Arial" w:eastAsia="Arial" w:hAnsi="Arial"/>
           <w:b/>
           <w:bCs/>
-          <w:color w:val="2A2440"/>
+          <w:color w:val="2A0A1E"/>
           <w:sz w:val="32"/>
           <w:szCs w:val="32"/>
         </w:rPr>
@@ -4453,7 +4622,7 @@
           <w:sz w:val="20"/>
           <w:szCs w:val="20"/>
         </w:rPr>
-        <w:t xml:space="preserve"> (July 2026) — see the Resolved Bugs note under Feature 6 above. Root cause was a missing SUPABASE_SERVICE_ROLE_KEY env var compounded by two .single() vs .maybeSingle() bugs.</w:t>
+        <w:t xml:space="preserve"> (July 2026) — root cause was a missing SUPABASE_SERVICE_ROLE_KEY env var compounded by two .single() vs .maybeSingle() bugs.</w:t>
       </w:r>
     </w:p>
     <w:p>
@@ -4566,6 +4735,90 @@
           <w:szCs w:val="20"/>
         </w:rPr>
         <w:t xml:space="preserve"> (July 2026) — the old "you don’t have live inventory" line was replaced with instructions to search and link real bottle pages.</w:t>
+      </w:r>
+    </w:p>
+    <w:p>
+      <w:pPr>
+        <w:pStyle w:val="ListParagraph"/>
+        <w:numPr>
+          <w:ilvl w:val="0"/>
+          <w:numId w:val="2"/>
+        </w:numPr>
+        <w:spacing w:after="60" w:before="0"/>
+      </w:pPr>
+      <w:r>
+        <w:rPr>
+          <w:rFonts w:ascii="Arial" w:cs="Arial" w:eastAsia="Arial" w:hAnsi="Arial"/>
+          <w:b/>
+          <w:bCs/>
+          <w:sz w:val="20"/>
+          <w:szCs w:val="20"/>
+        </w:rPr>
+        <w:t xml:space="preserve">Account deletion always failed for users with saved data</w:t>
+      </w:r>
+      <w:r>
+        <w:rPr>
+          <w:rFonts w:ascii="Arial" w:cs="Arial" w:eastAsia="Arial" w:hAnsi="Arial"/>
+          <w:sz w:val="20"/>
+          <w:szCs w:val="20"/>
+        </w:rPr>
+        <w:t xml:space="preserve"> (August 2026) — conversations, palate_profile, and messages foreign keys were ON DELETE NO ACTION instead of CASCADE, so deleteUser() failed with a foreign key violation for any user with saved data. Fixed by altering all three constraints to cascade.</w:t>
+      </w:r>
+    </w:p>
+    <w:p>
+      <w:pPr>
+        <w:pStyle w:val="ListParagraph"/>
+        <w:numPr>
+          <w:ilvl w:val="0"/>
+          <w:numId w:val="2"/>
+        </w:numPr>
+        <w:spacing w:after="60" w:before="0"/>
+      </w:pPr>
+      <w:r>
+        <w:rPr>
+          <w:rFonts w:ascii="Arial" w:cs="Arial" w:eastAsia="Arial" w:hAnsi="Arial"/>
+          <w:b/>
+          <w:bCs/>
+          <w:sz w:val="20"/>
+          <w:szCs w:val="20"/>
+        </w:rPr>
+        <w:t xml:space="preserve">Account-deleted flow left an empty, unseeded chat</w:t>
+      </w:r>
+      <w:r>
+        <w:rPr>
+          <w:rFonts w:ascii="Arial" w:cs="Arial" w:eastAsia="Arial" w:hAnsi="Arial"/>
+          <w:sz w:val="20"/>
+          <w:szCs w:val="20"/>
+        </w:rPr>
+        <w:t xml:space="preserve"> (August 2026) — deleteAccount() reset chat state but never re-triggered Wini’s greeting. Fixed with a success overlay whose dismissal always calls init().</w:t>
+      </w:r>
+    </w:p>
+    <w:p>
+      <w:pPr>
+        <w:pStyle w:val="ListParagraph"/>
+        <w:numPr>
+          <w:ilvl w:val="0"/>
+          <w:numId w:val="2"/>
+        </w:numPr>
+        <w:spacing w:after="60" w:before="0"/>
+      </w:pPr>
+      <w:r>
+        <w:rPr>
+          <w:rFonts w:ascii="Arial" w:cs="Arial" w:eastAsia="Arial" w:hAnsi="Arial"/>
+          <w:b/>
+          <w:bCs/>
+          <w:sz w:val="20"/>
+          <w:szCs w:val="20"/>
+        </w:rPr>
+        <w:t xml:space="preserve">Quality floor rule diluted in multi-wine outputs</w:t>
+      </w:r>
+      <w:r>
+        <w:rPr>
+          <w:rFonts w:ascii="Arial" w:cs="Arial" w:eastAsia="Arial" w:hAnsi="Arial"/>
+          <w:sz w:val="20"/>
+          <w:szCs w:val="20"/>
+        </w:rPr>
+        <w:t xml:space="preserve"> (August 2026) — quality floor rules lived several sections downstream of the actual recommendation-generation logic, so they held on direct single-wine asks but got diluted in multi-bottle outputs. Fixed by merging into a renamed RULES FOR EVERY RECOMMENDATION section with an explicit scope line.</w:t>
       </w:r>
     </w:p>
     <w:sectPr>
@@ -4626,14 +4879,14 @@
   <w:p>
     <w:pPr>
       <w:pBdr>
-        <w:top w:val="single" w:color="C5C0D4" w:sz="4" w:space="1"/>
+        <w:top w:val="single" w:color="C4A898" w:sz="4" w:space="1"/>
       </w:pBdr>
       <w:jc w:val="right"/>
     </w:pPr>
     <w:r>
       <w:rPr>
         <w:rFonts w:ascii="Arial" w:cs="Arial" w:eastAsia="Arial" w:hAnsi="Arial"/>
-        <w:color w:val="7B6FA0"/>
+        <w:color w:val="6B4455"/>
         <w:sz w:val="18"/>
         <w:szCs w:val="18"/>
       </w:rPr>
@@ -4642,7 +4895,7 @@
     <w:r>
       <w:rPr>
         <w:rFonts w:ascii="Arial" w:cs="Arial" w:eastAsia="Arial" w:hAnsi="Arial"/>
-        <w:color w:val="7B6FA0"/>
+        <w:color w:val="6B4455"/>
         <w:sz w:val="18"/>
         <w:szCs w:val="18"/>
       </w:rPr>
@@ -4654,7 +4907,7 @@
     <w:r>
       <w:rPr>
         <w:rFonts w:ascii="Arial" w:cs="Arial" w:eastAsia="Arial" w:hAnsi="Arial"/>
-        <w:color w:val="7B6FA0"/>
+        <w:color w:val="6B4455"/>
         <w:sz w:val="18"/>
         <w:szCs w:val="18"/>
       </w:rPr>
@@ -4663,7 +4916,7 @@
     <w:r>
       <w:rPr>
         <w:rFonts w:ascii="Arial" w:cs="Arial" w:eastAsia="Arial" w:hAnsi="Arial"/>
-        <w:color w:val="7B6FA0"/>
+        <w:color w:val="6B4455"/>
         <w:sz w:val="18"/>
         <w:szCs w:val="18"/>
       </w:rPr>
@@ -4718,13 +4971,13 @@
   <w:p>
     <w:pPr>
       <w:pBdr>
-        <w:bottom w:val="single" w:color="C5C0D4" w:sz="4" w:space="1"/>
+        <w:bottom w:val="single" w:color="C4A898" w:sz="4" w:space="1"/>
       </w:pBdr>
     </w:pPr>
     <w:r>
       <w:rPr>
         <w:rFonts w:ascii="Arial" w:cs="Arial" w:eastAsia="Arial" w:hAnsi="Arial"/>
-        <w:color w:val="7B6FA0"/>
+        <w:color w:val="6B4455"/>
         <w:sz w:val="18"/>
         <w:szCs w:val="18"/>
       </w:rPr>

</xml_diff>

<commit_message>
Document the Pinot Noir/Nebbiolo three-band pricing fix
Adds a Recently Resolved entry for the quality floor rule that just
went live. Regenerates the Word doc to match.

Co-Authored-By: Claude Sonnet 5 <noreply@anthropic.com>
</commit_message>
<xml_diff>
--- a/Winederella-Architecture.docx
+++ b/Winederella-Architecture.docx
@@ -4821,6 +4821,34 @@
         <w:t xml:space="preserve"> (August 2026) — quality floor rules lived several sections downstream of the actual recommendation-generation logic, so they held on direct single-wine asks but got diluted in multi-bottle outputs. Fixed by merging into a renamed RULES FOR EVERY RECOMMENDATION section with an explicit scope line.</w:t>
       </w:r>
     </w:p>
+    <w:p>
+      <w:pPr>
+        <w:pStyle w:val="ListParagraph"/>
+        <w:numPr>
+          <w:ilvl w:val="0"/>
+          <w:numId w:val="2"/>
+        </w:numPr>
+        <w:spacing w:after="60" w:before="0"/>
+      </w:pPr>
+      <w:r>
+        <w:rPr>
+          <w:rFonts w:ascii="Arial" w:cs="Arial" w:eastAsia="Arial" w:hAnsi="Arial"/>
+          <w:b/>
+          <w:bCs/>
+          <w:sz w:val="20"/>
+          <w:szCs w:val="20"/>
+        </w:rPr>
+        <w:t xml:space="preserve">Pinot Noir/Nebbiolo rule was too blunt at the margin</w:t>
+      </w:r>
+      <w:r>
+        <w:rPr>
+          <w:rFonts w:ascii="Arial" w:cs="Arial" w:eastAsia="Arial" w:hAnsi="Arial"/>
+          <w:sz w:val="20"/>
+          <w:szCs w:val="20"/>
+        </w:rPr>
+        <w:t xml:space="preserve"> (August 2026) — the flat "never under $30" rule didn’t distinguish a genuine risk zone from a defensible judgment call. Replaced with three price bands: under $25 steers to alternatives, $25–$30 allows a bottle only if worth standing behind (flagged casually), $30+ needs no caveat. Rose exception and white/red floors unchanged.</w:t>
+      </w:r>
+    </w:p>
     <w:sectPr>
       <w:headerReference w:type="default" r:id="rId7"/>
       <w:footerReference w:type="default" r:id="rId8"/>

</xml_diff>